<commit_message>
Sinkronkan dokumen perencanaan model dengan RENCANA_EKSEKUSI_LANJUTAN v8.0
- Tambah RENCANA_EKSEKUSI_LANJUTAN.md (roadmap TAHAP 0-6, GATE1/GATE2)
- Tambah PROGRESS_SAAT_INI.md
- Tandai bagian usang/koreksi di MASTER_PLAN, FUTURE BEST PLAN,
  SARAN_TAMBAHAN_PIXEL_PATCH, RECOVERY_LABEL_ANOMALI agar konsisten
</commit_message>
<xml_diff>
--- a/docs/Buku_Panduan_ForestWatch_Papua_v3.docx
+++ b/docs/Buku_Panduan_ForestWatch_Papua_v3.docx
@@ -298,24 +298,13 @@
       <w:pPr>
         <w:spacing w:after="200"/>
         <w:jc w:val="center"/>
-        <w:rPr>
-          <w:lang w:val="sv-SE"/>
-        </w:rPr>
       </w:pPr>
       <w:r>
         <w:t>Versi 3.0 — 7 Kelas, Label Fusion Dynamic World-base, Upgrade Dataset (FDP Palm 2025a + Global Mining Footprint)</w:t>
       </w:r>
     </w:p>
     <w:p>
-      <w:pPr>
-        <w:rPr>
-          <w:lang w:val="sv-SE"/>
-        </w:rPr>
-      </w:pPr>
-      <w:r>
-        <w:rPr>
-          <w:lang w:val="sv-SE"/>
-        </w:rPr>
+      <w:r>
         <w:br w:type="page"/>
       </w:r>
     </w:p>
@@ -3342,6 +3331,9 @@
         </w:rPr>
       </w:pPr>
       <w:r>
+        <w:rPr>
+          <w:lang w:val="sv-SE"/>
+        </w:rPr>
         <w:t>Sistem ForestWatch Papua bekerja dengan menganalisis citra satelit multispektral, mengklasifikasikan setiap piksel citra menjadi tujuh kategori tutupan lahan, lalu membandingkan hasil klasifikasi antar dua periode waktu untuk mendeteksi area yang berubah dari hutan menjadi non-hutan. Setiap kejadian deforestasi yang terdeteksi dicatat lengkap dengan koordinat GPS, estimasi luas dalam hektar, tanggal, jenis transisi (menjadi sawit, pertanian, lahan terbuka/tambang, atau lahan terbuka), dan status kawasan.</w:t>
       </w:r>
     </w:p>
@@ -3463,60 +3455,27 @@
         <w:spacing w:after="120" w:line="320" w:lineRule="auto"/>
         <w:jc w:val="both"/>
       </w:pPr>
-      <w:proofErr w:type="spellStart"/>
-      <w:proofErr w:type="spellEnd"/>
-      <w:proofErr w:type="spellStart"/>
-      <w:proofErr w:type="spellEnd"/>
-      <w:proofErr w:type="spellStart"/>
-      <w:proofErr w:type="spellEnd"/>
-      <w:proofErr w:type="spellStart"/>
-      <w:proofErr w:type="spellEnd"/>
-      <w:proofErr w:type="spellStart"/>
-      <w:proofErr w:type="spellEnd"/>
-      <w:proofErr w:type="spellStart"/>
-      <w:proofErr w:type="spellEnd"/>
-      <w:proofErr w:type="spellStart"/>
-      <w:proofErr w:type="spellEnd"/>
-      <w:proofErr w:type="spellStart"/>
-      <w:proofErr w:type="spellEnd"/>
-      <w:proofErr w:type="spellStart"/>
-      <w:proofErr w:type="spellEnd"/>
-      <w:proofErr w:type="spellStart"/>
-      <w:proofErr w:type="spellEnd"/>
-      <w:proofErr w:type="spellStart"/>
-      <w:proofErr w:type="spellEnd"/>
-      <w:proofErr w:type="spellStart"/>
-      <w:proofErr w:type="spellEnd"/>
-      <w:proofErr w:type="spellStart"/>
-      <w:proofErr w:type="spellEnd"/>
-      <w:proofErr w:type="spellStart"/>
-      <w:proofErr w:type="spellEnd"/>
-      <w:proofErr w:type="spellStart"/>
-      <w:proofErr w:type="spellEnd"/>
-      <w:proofErr w:type="spellStart"/>
-      <w:proofErr w:type="spellEnd"/>
-      <w:proofErr w:type="spellStart"/>
-      <w:proofErr w:type="spellEnd"/>
-      <w:proofErr w:type="spellStart"/>
-      <w:proofErr w:type="spellEnd"/>
-      <w:proofErr w:type="spellStart"/>
-      <w:proofErr w:type="spellEnd"/>
-      <w:proofErr w:type="spellStart"/>
-      <w:proofErr w:type="spellEnd"/>
-      <w:proofErr w:type="spellStart"/>
-      <w:proofErr w:type="spellEnd"/>
-      <w:proofErr w:type="spellStart"/>
-      <w:proofErr w:type="spellEnd"/>
-      <w:proofErr w:type="spellStart"/>
-      <w:proofErr w:type="spellEnd"/>
-      <w:proofErr w:type="spellStart"/>
-      <w:proofErr w:type="spellEnd"/>
-      <w:proofErr w:type="spellStart"/>
-      <w:proofErr w:type="spellEnd"/>
-      <w:proofErr w:type="spellStart"/>
-      <w:proofErr w:type="spellEnd"/>
-      <w:r>
-        <w:t>Setelah validasi langsung ke katalog resmi Google Earth Engine dan tinjauan literatur ilmiah, proyek ini menggunakan ENAM dataset yang masing-masing memiliki peran berbeda. Semua dataset tersedia gratis di Google Earth Engine (GEE) dan tidak perlu diunduh secara manual ke laptop. Pendekatan multi-sumber ini diadopsi karena tidak ada satu dataset tunggal yang dapat menyediakan label berkualitas untuk seluruh tujuh kelas tutupan lahan yang diinginkan.</w:t>
+      <w:r>
+        <w:rPr>
+          <w:lang w:val="sv-SE"/>
+        </w:rPr>
+        <w:t xml:space="preserve">Setelah validasi langsung ke katalog resmi Google Earth Engine dan tinjauan literatur ilmiah, proyek ini menggunakan ENAM dataset yang masing-masing memiliki peran berbeda. </w:t>
+      </w:r>
+      <w:proofErr w:type="spellStart"/>
+      <w:r>
+        <w:t>Semua</w:t>
+      </w:r>
+      <w:proofErr w:type="spellEnd"/>
+      <w:r>
+        <w:t xml:space="preserve"> dataset </w:t>
+      </w:r>
+      <w:proofErr w:type="spellStart"/>
+      <w:r>
+        <w:t>tersedia</w:t>
+      </w:r>
+      <w:proofErr w:type="spellEnd"/>
+      <w:r>
+        <w:t xml:space="preserve"> gratis di Google Earth Engine (GEE) dan tidak perlu diunduh secara manual ke laptop. Pendekatan multi-sumber ini diadopsi karena tidak ada satu dataset tunggal yang dapat menyediakan label berkualitas untuk seluruh tujuh kelas tutupan lahan yang diinginkan.</w:t>
       </w:r>
     </w:p>
     <w:p>
@@ -3560,7 +3519,7 @@
     </w:p>
     <w:tbl>
       <w:tblPr>
-        <w:tblW w:w="9360" w:type="dxa"/>
+        <w:tblW w:w="10391" w:type="dxa"/>
         <w:tblBorders>
           <w:top w:val="single" w:sz="4" w:space="0" w:color="auto"/>
           <w:left w:val="single" w:sz="4" w:space="0" w:color="auto"/>
@@ -3576,25 +3535,19 @@
         <w:tblLook w:val="04A0" w:firstRow="1" w:lastRow="0" w:firstColumn="1" w:lastColumn="0" w:noHBand="0" w:noVBand="1"/>
       </w:tblPr>
       <w:tblGrid>
-        <w:gridCol w:w="664"/>
-        <w:gridCol w:w="1474"/>
-        <w:gridCol w:w="4628"/>
-        <w:gridCol w:w="1437"/>
-        <w:gridCol w:w="1157"/>
+        <w:gridCol w:w="547"/>
+        <w:gridCol w:w="1359"/>
+        <w:gridCol w:w="5820"/>
+        <w:gridCol w:w="1479"/>
+        <w:gridCol w:w="1186"/>
       </w:tblGrid>
       <w:tr>
-        <w:tblPrEx>
-          <w:tblCellMar>
-            <w:top w:w="0" w:type="dxa"/>
-            <w:bottom w:w="0" w:type="dxa"/>
-          </w:tblCellMar>
-        </w:tblPrEx>
         <w:trPr>
           <w:tblHeader/>
         </w:trPr>
         <w:tc>
           <w:tcPr>
-            <w:tcW w:w="1400" w:type="dxa"/>
+            <w:tcW w:w="547" w:type="dxa"/>
             <w:tcBorders>
               <w:top w:val="single" w:sz="4" w:space="0" w:color="888888"/>
               <w:left w:val="single" w:sz="4" w:space="0" w:color="888888"/>
@@ -3622,7 +3575,7 @@
         </w:tc>
         <w:tc>
           <w:tcPr>
-            <w:tcW w:w="2200" w:type="dxa"/>
+            <w:tcW w:w="1359" w:type="dxa"/>
             <w:tcBorders>
               <w:top w:val="single" w:sz="4" w:space="0" w:color="888888"/>
               <w:left w:val="single" w:sz="4" w:space="0" w:color="888888"/>
@@ -3650,7 +3603,7 @@
         </w:tc>
         <w:tc>
           <w:tcPr>
-            <w:tcW w:w="2400" w:type="dxa"/>
+            <w:tcW w:w="4610" w:type="dxa"/>
             <w:tcBorders>
               <w:top w:val="single" w:sz="4" w:space="0" w:color="888888"/>
               <w:left w:val="single" w:sz="4" w:space="0" w:color="888888"/>
@@ -3678,7 +3631,7 @@
         </w:tc>
         <w:tc>
           <w:tcPr>
-            <w:tcW w:w="1860" w:type="dxa"/>
+            <w:tcW w:w="2689" w:type="dxa"/>
             <w:tcBorders>
               <w:top w:val="single" w:sz="4" w:space="0" w:color="888888"/>
               <w:left w:val="single" w:sz="4" w:space="0" w:color="888888"/>
@@ -3706,7 +3659,7 @@
         </w:tc>
         <w:tc>
           <w:tcPr>
-            <w:tcW w:w="1500" w:type="dxa"/>
+            <w:tcW w:w="1186" w:type="dxa"/>
             <w:tcBorders>
               <w:top w:val="single" w:sz="4" w:space="0" w:color="888888"/>
               <w:left w:val="single" w:sz="4" w:space="0" w:color="888888"/>
@@ -3745,15 +3698,9 @@
         </w:tc>
       </w:tr>
       <w:tr>
-        <w:tblPrEx>
-          <w:tblCellMar>
-            <w:top w:w="0" w:type="dxa"/>
-            <w:bottom w:w="0" w:type="dxa"/>
-          </w:tblCellMar>
-        </w:tblPrEx>
-        <w:tc>
-          <w:tcPr>
-            <w:tcW w:w="1400" w:type="dxa"/>
+        <w:tc>
+          <w:tcPr>
+            <w:tcW w:w="547" w:type="dxa"/>
             <w:tcBorders>
               <w:top w:val="single" w:sz="4" w:space="0" w:color="888888"/>
               <w:left w:val="single" w:sz="4" w:space="0" w:color="888888"/>
@@ -3779,7 +3726,7 @@
         </w:tc>
         <w:tc>
           <w:tcPr>
-            <w:tcW w:w="2200" w:type="dxa"/>
+            <w:tcW w:w="1359" w:type="dxa"/>
             <w:tcBorders>
               <w:top w:val="single" w:sz="4" w:space="0" w:color="888888"/>
               <w:left w:val="single" w:sz="4" w:space="0" w:color="888888"/>
@@ -3805,7 +3752,7 @@
         </w:tc>
         <w:tc>
           <w:tcPr>
-            <w:tcW w:w="2400" w:type="dxa"/>
+            <w:tcW w:w="4610" w:type="dxa"/>
             <w:tcBorders>
               <w:top w:val="single" w:sz="4" w:space="0" w:color="888888"/>
               <w:left w:val="single" w:sz="4" w:space="0" w:color="888888"/>
@@ -3831,7 +3778,7 @@
         </w:tc>
         <w:tc>
           <w:tcPr>
-            <w:tcW w:w="1860" w:type="dxa"/>
+            <w:tcW w:w="2689" w:type="dxa"/>
             <w:tcBorders>
               <w:top w:val="single" w:sz="4" w:space="0" w:color="888888"/>
               <w:left w:val="single" w:sz="4" w:space="0" w:color="888888"/>
@@ -3857,7 +3804,7 @@
         </w:tc>
         <w:tc>
           <w:tcPr>
-            <w:tcW w:w="1500" w:type="dxa"/>
+            <w:tcW w:w="1186" w:type="dxa"/>
             <w:tcBorders>
               <w:top w:val="single" w:sz="4" w:space="0" w:color="888888"/>
               <w:left w:val="single" w:sz="4" w:space="0" w:color="888888"/>
@@ -3892,15 +3839,9 @@
         </w:tc>
       </w:tr>
       <w:tr>
-        <w:tblPrEx>
-          <w:tblCellMar>
-            <w:top w:w="0" w:type="dxa"/>
-            <w:bottom w:w="0" w:type="dxa"/>
-          </w:tblCellMar>
-        </w:tblPrEx>
-        <w:tc>
-          <w:tcPr>
-            <w:tcW w:w="1400" w:type="dxa"/>
+        <w:tc>
+          <w:tcPr>
+            <w:tcW w:w="547" w:type="dxa"/>
             <w:tcBorders>
               <w:top w:val="single" w:sz="4" w:space="0" w:color="888888"/>
               <w:left w:val="single" w:sz="4" w:space="0" w:color="888888"/>
@@ -3926,7 +3867,7 @@
         </w:tc>
         <w:tc>
           <w:tcPr>
-            <w:tcW w:w="2200" w:type="dxa"/>
+            <w:tcW w:w="1359" w:type="dxa"/>
             <w:tcBorders>
               <w:top w:val="single" w:sz="4" w:space="0" w:color="888888"/>
               <w:left w:val="single" w:sz="4" w:space="0" w:color="888888"/>
@@ -3968,23 +3909,21 @@
         </w:tc>
         <w:tc>
           <w:tcPr>
-            <w:tcW w:w="2400" w:type="dxa"/>
-            <w:tcBorders>
-              <w:top w:val="single" w:sz="4" w:space="0" w:color="888888"/>
-              <w:left w:val="single" w:sz="4" w:space="0" w:color="888888"/>
-              <w:bottom w:val="single" w:sz="4" w:space="0" w:color="888888"/>
-              <w:right w:val="single" w:sz="4" w:space="0" w:color="888888"/>
-            </w:tcBorders>
-            <w:tcMar>
-              <w:top w:w="100" w:type="dxa"/>
-              <w:left w:w="140" w:type="dxa"/>
-              <w:bottom w:w="100" w:type="dxa"/>
-              <w:right w:w="140" w:type="dxa"/>
-            </w:tcMar>
-          </w:tcPr>
-          <w:p>
-            <w:proofErr w:type="spellStart"/>
-            <w:proofErr w:type="spellEnd"/>
+            <w:tcW w:w="4610" w:type="dxa"/>
+            <w:tcBorders>
+              <w:top w:val="single" w:sz="4" w:space="0" w:color="888888"/>
+              <w:left w:val="single" w:sz="4" w:space="0" w:color="888888"/>
+              <w:bottom w:val="single" w:sz="4" w:space="0" w:color="888888"/>
+              <w:right w:val="single" w:sz="4" w:space="0" w:color="888888"/>
+            </w:tcBorders>
+            <w:tcMar>
+              <w:top w:w="100" w:type="dxa"/>
+              <w:left w:w="140" w:type="dxa"/>
+              <w:bottom w:w="100" w:type="dxa"/>
+              <w:right w:w="140" w:type="dxa"/>
+            </w:tcMar>
+          </w:tcPr>
+          <w:p>
             <w:r>
               <w:t>ESA/WorldCover/v200/2021</w:t>
             </w:r>
@@ -3992,25 +3931,21 @@
         </w:tc>
         <w:tc>
           <w:tcPr>
-            <w:tcW w:w="1860" w:type="dxa"/>
-            <w:tcBorders>
-              <w:top w:val="single" w:sz="4" w:space="0" w:color="888888"/>
-              <w:left w:val="single" w:sz="4" w:space="0" w:color="888888"/>
-              <w:bottom w:val="single" w:sz="4" w:space="0" w:color="888888"/>
-              <w:right w:val="single" w:sz="4" w:space="0" w:color="888888"/>
-            </w:tcBorders>
-            <w:tcMar>
-              <w:top w:w="100" w:type="dxa"/>
-              <w:left w:w="140" w:type="dxa"/>
-              <w:bottom w:w="100" w:type="dxa"/>
-              <w:right w:w="140" w:type="dxa"/>
-            </w:tcMar>
-          </w:tcPr>
-          <w:p>
-            <w:proofErr w:type="spellStart"/>
-            <w:proofErr w:type="spellEnd"/>
-            <w:proofErr w:type="spellStart"/>
-            <w:proofErr w:type="spellEnd"/>
+            <w:tcW w:w="2689" w:type="dxa"/>
+            <w:tcBorders>
+              <w:top w:val="single" w:sz="4" w:space="0" w:color="888888"/>
+              <w:left w:val="single" w:sz="4" w:space="0" w:color="888888"/>
+              <w:bottom w:val="single" w:sz="4" w:space="0" w:color="888888"/>
+              <w:right w:val="single" w:sz="4" w:space="0" w:color="888888"/>
+            </w:tcBorders>
+            <w:tcMar>
+              <w:top w:w="100" w:type="dxa"/>
+              <w:left w:w="140" w:type="dxa"/>
+              <w:bottom w:w="100" w:type="dxa"/>
+              <w:right w:w="140" w:type="dxa"/>
+            </w:tcMar>
+          </w:tcPr>
+          <w:p>
             <w:r>
               <w:t>Cross-check tutupan lahan, penguat Hutan (UNION opsional)</w:t>
             </w:r>
@@ -4018,7 +3953,7 @@
         </w:tc>
         <w:tc>
           <w:tcPr>
-            <w:tcW w:w="1500" w:type="dxa"/>
+            <w:tcW w:w="1186" w:type="dxa"/>
             <w:tcBorders>
               <w:top w:val="single" w:sz="4" w:space="0" w:color="888888"/>
               <w:left w:val="single" w:sz="4" w:space="0" w:color="888888"/>
@@ -4040,15 +3975,9 @@
         </w:tc>
       </w:tr>
       <w:tr>
-        <w:tblPrEx>
-          <w:tblCellMar>
-            <w:top w:w="0" w:type="dxa"/>
-            <w:bottom w:w="0" w:type="dxa"/>
-          </w:tblCellMar>
-        </w:tblPrEx>
-        <w:tc>
-          <w:tcPr>
-            <w:tcW w:w="1400" w:type="dxa"/>
+        <w:tc>
+          <w:tcPr>
+            <w:tcW w:w="547" w:type="dxa"/>
             <w:tcBorders>
               <w:top w:val="single" w:sz="4" w:space="0" w:color="888888"/>
               <w:left w:val="single" w:sz="4" w:space="0" w:color="888888"/>
@@ -4074,7 +4003,7 @@
         </w:tc>
         <w:tc>
           <w:tcPr>
-            <w:tcW w:w="2200" w:type="dxa"/>
+            <w:tcW w:w="1359" w:type="dxa"/>
             <w:tcBorders>
               <w:top w:val="single" w:sz="4" w:space="0" w:color="888888"/>
               <w:left w:val="single" w:sz="4" w:space="0" w:color="888888"/>
@@ -4100,7 +4029,7 @@
         </w:tc>
         <w:tc>
           <w:tcPr>
-            <w:tcW w:w="2400" w:type="dxa"/>
+            <w:tcW w:w="4610" w:type="dxa"/>
             <w:tcBorders>
               <w:top w:val="single" w:sz="4" w:space="0" w:color="888888"/>
               <w:left w:val="single" w:sz="4" w:space="0" w:color="888888"/>
@@ -4126,63 +4055,69 @@
         </w:tc>
         <w:tc>
           <w:tcPr>
-            <w:tcW w:w="1860" w:type="dxa"/>
-            <w:tcBorders>
-              <w:top w:val="single" w:sz="4" w:space="0" w:color="888888"/>
-              <w:left w:val="single" w:sz="4" w:space="0" w:color="888888"/>
-              <w:bottom w:val="single" w:sz="4" w:space="0" w:color="888888"/>
-              <w:right w:val="single" w:sz="4" w:space="0" w:color="888888"/>
-            </w:tcBorders>
-            <w:tcMar>
-              <w:top w:w="100" w:type="dxa"/>
-              <w:left w:w="140" w:type="dxa"/>
-              <w:bottom w:w="100" w:type="dxa"/>
-              <w:right w:w="140" w:type="dxa"/>
-            </w:tcMar>
-          </w:tcPr>
-          <w:p>
-            <w:proofErr w:type="spellStart"/>
-            <w:proofErr w:type="spellEnd"/>
-            <w:r>
+            <w:tcW w:w="2689" w:type="dxa"/>
+            <w:tcBorders>
+              <w:top w:val="single" w:sz="4" w:space="0" w:color="888888"/>
+              <w:left w:val="single" w:sz="4" w:space="0" w:color="888888"/>
+              <w:bottom w:val="single" w:sz="4" w:space="0" w:color="888888"/>
+              <w:right w:val="single" w:sz="4" w:space="0" w:color="888888"/>
+            </w:tcBorders>
+            <w:tcMar>
+              <w:top w:w="100" w:type="dxa"/>
+              <w:left w:w="140" w:type="dxa"/>
+              <w:bottom w:w="100" w:type="dxa"/>
+              <w:right w:w="140" w:type="dxa"/>
+            </w:tcMar>
+          </w:tcPr>
+          <w:p>
+            <w:pPr>
+              <w:rPr>
+                <w:lang w:val="sv-SE"/>
+              </w:rPr>
+            </w:pPr>
+            <w:r>
+              <w:rPr>
+                <w:lang w:val="sv-SE"/>
+              </w:rPr>
               <w:t>Peta dasar label (remap 9→7 kelas)</w:t>
             </w:r>
           </w:p>
         </w:tc>
         <w:tc>
           <w:tcPr>
-            <w:tcW w:w="1500" w:type="dxa"/>
-            <w:tcBorders>
-              <w:top w:val="single" w:sz="4" w:space="0" w:color="888888"/>
-              <w:left w:val="single" w:sz="4" w:space="0" w:color="888888"/>
-              <w:bottom w:val="single" w:sz="4" w:space="0" w:color="888888"/>
-              <w:right w:val="single" w:sz="4" w:space="0" w:color="888888"/>
-            </w:tcBorders>
-            <w:tcMar>
-              <w:top w:w="100" w:type="dxa"/>
-              <w:left w:w="140" w:type="dxa"/>
-              <w:bottom w:w="100" w:type="dxa"/>
-              <w:right w:w="140" w:type="dxa"/>
-            </w:tcMar>
-          </w:tcPr>
-          <w:p>
-            <w:proofErr w:type="spellStart"/>
-            <w:proofErr w:type="spellEnd"/>
-            <w:r>
-              <w:t>2015–sekarang (2025)</w:t>
+            <w:tcW w:w="1186" w:type="dxa"/>
+            <w:tcBorders>
+              <w:top w:val="single" w:sz="4" w:space="0" w:color="888888"/>
+              <w:left w:val="single" w:sz="4" w:space="0" w:color="888888"/>
+              <w:bottom w:val="single" w:sz="4" w:space="0" w:color="888888"/>
+              <w:right w:val="single" w:sz="4" w:space="0" w:color="888888"/>
+            </w:tcBorders>
+            <w:tcMar>
+              <w:top w:w="100" w:type="dxa"/>
+              <w:left w:w="140" w:type="dxa"/>
+              <w:bottom w:w="100" w:type="dxa"/>
+              <w:right w:w="140" w:type="dxa"/>
+            </w:tcMar>
+          </w:tcPr>
+          <w:p>
+            <w:r>
+              <w:t>2015–</w:t>
+            </w:r>
+            <w:proofErr w:type="spellStart"/>
+            <w:r>
+              <w:t>sekarang</w:t>
+            </w:r>
+            <w:proofErr w:type="spellEnd"/>
+            <w:r>
+              <w:t xml:space="preserve"> (2025)</w:t>
             </w:r>
           </w:p>
         </w:tc>
       </w:tr>
       <w:tr>
-        <w:tblPrEx>
-          <w:tblCellMar>
-            <w:top w:w="0" w:type="dxa"/>
-            <w:bottom w:w="0" w:type="dxa"/>
-          </w:tblCellMar>
-        </w:tblPrEx>
-        <w:tc>
-          <w:tcPr>
-            <w:tcW w:w="1400" w:type="dxa"/>
+        <w:tc>
+          <w:tcPr>
+            <w:tcW w:w="547" w:type="dxa"/>
             <w:tcBorders>
               <w:top w:val="single" w:sz="4" w:space="0" w:color="888888"/>
               <w:left w:val="single" w:sz="4" w:space="0" w:color="888888"/>
@@ -4208,7 +4143,7 @@
         </w:tc>
         <w:tc>
           <w:tcPr>
-            <w:tcW w:w="2200" w:type="dxa"/>
+            <w:tcW w:w="1359" w:type="dxa"/>
             <w:tcBorders>
               <w:top w:val="single" w:sz="4" w:space="0" w:color="888888"/>
               <w:left w:val="single" w:sz="4" w:space="0" w:color="888888"/>
@@ -4230,23 +4165,21 @@
         </w:tc>
         <w:tc>
           <w:tcPr>
-            <w:tcW w:w="2400" w:type="dxa"/>
-            <w:tcBorders>
-              <w:top w:val="single" w:sz="4" w:space="0" w:color="888888"/>
-              <w:left w:val="single" w:sz="4" w:space="0" w:color="888888"/>
-              <w:bottom w:val="single" w:sz="4" w:space="0" w:color="888888"/>
-              <w:right w:val="single" w:sz="4" w:space="0" w:color="888888"/>
-            </w:tcBorders>
-            <w:tcMar>
-              <w:top w:w="100" w:type="dxa"/>
-              <w:left w:w="140" w:type="dxa"/>
-              <w:bottom w:w="100" w:type="dxa"/>
-              <w:right w:w="140" w:type="dxa"/>
-            </w:tcMar>
-          </w:tcPr>
-          <w:p>
-            <w:proofErr w:type="spellStart"/>
-            <w:proofErr w:type="spellEnd"/>
+            <w:tcW w:w="4610" w:type="dxa"/>
+            <w:tcBorders>
+              <w:top w:val="single" w:sz="4" w:space="0" w:color="888888"/>
+              <w:left w:val="single" w:sz="4" w:space="0" w:color="888888"/>
+              <w:bottom w:val="single" w:sz="4" w:space="0" w:color="888888"/>
+              <w:right w:val="single" w:sz="4" w:space="0" w:color="888888"/>
+            </w:tcBorders>
+            <w:tcMar>
+              <w:top w:w="100" w:type="dxa"/>
+              <w:left w:w="140" w:type="dxa"/>
+              <w:bottom w:w="100" w:type="dxa"/>
+              <w:right w:w="140" w:type="dxa"/>
+            </w:tcMar>
+          </w:tcPr>
+          <w:p>
             <w:r>
               <w:t>UMD/hansen/global_forest_change_2025_v1_13</w:t>
             </w:r>
@@ -4254,23 +4187,21 @@
         </w:tc>
         <w:tc>
           <w:tcPr>
-            <w:tcW w:w="1860" w:type="dxa"/>
-            <w:tcBorders>
-              <w:top w:val="single" w:sz="4" w:space="0" w:color="888888"/>
-              <w:left w:val="single" w:sz="4" w:space="0" w:color="888888"/>
-              <w:bottom w:val="single" w:sz="4" w:space="0" w:color="888888"/>
-              <w:right w:val="single" w:sz="4" w:space="0" w:color="888888"/>
-            </w:tcBorders>
-            <w:tcMar>
-              <w:top w:w="100" w:type="dxa"/>
-              <w:left w:w="140" w:type="dxa"/>
-              <w:bottom w:w="100" w:type="dxa"/>
-              <w:right w:w="140" w:type="dxa"/>
-            </w:tcMar>
-          </w:tcPr>
-          <w:p>
-            <w:proofErr w:type="spellStart"/>
-            <w:proofErr w:type="spellEnd"/>
+            <w:tcW w:w="2689" w:type="dxa"/>
+            <w:tcBorders>
+              <w:top w:val="single" w:sz="4" w:space="0" w:color="888888"/>
+              <w:left w:val="single" w:sz="4" w:space="0" w:color="888888"/>
+              <w:bottom w:val="single" w:sz="4" w:space="0" w:color="888888"/>
+              <w:right w:val="single" w:sz="4" w:space="0" w:color="888888"/>
+            </w:tcBorders>
+            <w:tcMar>
+              <w:top w:w="100" w:type="dxa"/>
+              <w:left w:w="140" w:type="dxa"/>
+              <w:bottom w:w="100" w:type="dxa"/>
+              <w:right w:w="140" w:type="dxa"/>
+            </w:tcMar>
+          </w:tcPr>
+          <w:p>
             <w:r>
               <w:t>Label Lahan Terbuka (lossyear ≥ 2019)</w:t>
             </w:r>
@@ -4278,7 +4209,7 @@
         </w:tc>
         <w:tc>
           <w:tcPr>
-            <w:tcW w:w="1500" w:type="dxa"/>
+            <w:tcW w:w="1186" w:type="dxa"/>
             <w:tcBorders>
               <w:top w:val="single" w:sz="4" w:space="0" w:color="888888"/>
               <w:left w:val="single" w:sz="4" w:space="0" w:color="888888"/>
@@ -4300,37 +4231,32 @@
         </w:tc>
       </w:tr>
       <w:tr>
-        <w:tblPrEx>
-          <w:tblCellMar>
-            <w:top w:w="0" w:type="dxa"/>
-            <w:bottom w:w="0" w:type="dxa"/>
-          </w:tblCellMar>
-        </w:tblPrEx>
-        <w:tc>
-          <w:tcPr>
-            <w:tcW w:w="1400" w:type="dxa"/>
-            <w:tcBorders>
-              <w:top w:val="single" w:sz="4" w:space="0" w:color="888888"/>
-              <w:left w:val="single" w:sz="4" w:space="0" w:color="888888"/>
-              <w:bottom w:val="single" w:sz="4" w:space="0" w:color="888888"/>
-              <w:right w:val="single" w:sz="4" w:space="0" w:color="888888"/>
-            </w:tcBorders>
-            <w:tcMar>
-              <w:top w:w="100" w:type="dxa"/>
-              <w:left w:w="140" w:type="dxa"/>
-              <w:bottom w:w="100" w:type="dxa"/>
-              <w:right w:w="140" w:type="dxa"/>
-            </w:tcMar>
-          </w:tcPr>
-          <w:p>
-            <w:r>
+        <w:tc>
+          <w:tcPr>
+            <w:tcW w:w="547" w:type="dxa"/>
+            <w:tcBorders>
+              <w:top w:val="single" w:sz="4" w:space="0" w:color="888888"/>
+              <w:left w:val="single" w:sz="4" w:space="0" w:color="888888"/>
+              <w:bottom w:val="single" w:sz="4" w:space="0" w:color="888888"/>
+              <w:right w:val="single" w:sz="4" w:space="0" w:color="888888"/>
+            </w:tcBorders>
+            <w:tcMar>
+              <w:top w:w="100" w:type="dxa"/>
+              <w:left w:w="140" w:type="dxa"/>
+              <w:bottom w:w="100" w:type="dxa"/>
+              <w:right w:w="140" w:type="dxa"/>
+            </w:tcMar>
+          </w:tcPr>
+          <w:p>
+            <w:r>
+              <w:lastRenderedPageBreak/>
               <w:t>5</w:t>
             </w:r>
           </w:p>
         </w:tc>
         <w:tc>
           <w:tcPr>
-            <w:tcW w:w="2200" w:type="dxa"/>
+            <w:tcW w:w="1359" w:type="dxa"/>
             <w:tcBorders>
               <w:top w:val="single" w:sz="4" w:space="0" w:color="888888"/>
               <w:left w:val="single" w:sz="4" w:space="0" w:color="888888"/>
@@ -4352,23 +4278,21 @@
         </w:tc>
         <w:tc>
           <w:tcPr>
-            <w:tcW w:w="2400" w:type="dxa"/>
-            <w:tcBorders>
-              <w:top w:val="single" w:sz="4" w:space="0" w:color="888888"/>
-              <w:left w:val="single" w:sz="4" w:space="0" w:color="888888"/>
-              <w:bottom w:val="single" w:sz="4" w:space="0" w:color="888888"/>
-              <w:right w:val="single" w:sz="4" w:space="0" w:color="888888"/>
-            </w:tcBorders>
-            <w:tcMar>
-              <w:top w:w="100" w:type="dxa"/>
-              <w:left w:w="140" w:type="dxa"/>
-              <w:bottom w:w="100" w:type="dxa"/>
-              <w:right w:w="140" w:type="dxa"/>
-            </w:tcMar>
-          </w:tcPr>
-          <w:p>
-            <w:proofErr w:type="spellStart"/>
-            <w:proofErr w:type="spellEnd"/>
+            <w:tcW w:w="4610" w:type="dxa"/>
+            <w:tcBorders>
+              <w:top w:val="single" w:sz="4" w:space="0" w:color="888888"/>
+              <w:left w:val="single" w:sz="4" w:space="0" w:color="888888"/>
+              <w:bottom w:val="single" w:sz="4" w:space="0" w:color="888888"/>
+              <w:right w:val="single" w:sz="4" w:space="0" w:color="888888"/>
+            </w:tcBorders>
+            <w:tcMar>
+              <w:top w:w="100" w:type="dxa"/>
+              <w:left w:w="140" w:type="dxa"/>
+              <w:bottom w:w="100" w:type="dxa"/>
+              <w:right w:w="140" w:type="dxa"/>
+            </w:tcMar>
+          </w:tcPr>
+          <w:p>
             <w:r>
               <w:t>projects/forestdatapartnership/assets/palm/model_2025a</w:t>
             </w:r>
@@ -4376,25 +4300,21 @@
         </w:tc>
         <w:tc>
           <w:tcPr>
-            <w:tcW w:w="1860" w:type="dxa"/>
-            <w:tcBorders>
-              <w:top w:val="single" w:sz="4" w:space="0" w:color="888888"/>
-              <w:left w:val="single" w:sz="4" w:space="0" w:color="888888"/>
-              <w:bottom w:val="single" w:sz="4" w:space="0" w:color="888888"/>
-              <w:right w:val="single" w:sz="4" w:space="0" w:color="888888"/>
-            </w:tcBorders>
-            <w:tcMar>
-              <w:top w:w="100" w:type="dxa"/>
-              <w:left w:w="140" w:type="dxa"/>
-              <w:bottom w:w="100" w:type="dxa"/>
-              <w:right w:w="140" w:type="dxa"/>
-            </w:tcMar>
-          </w:tcPr>
-          <w:p>
-            <w:proofErr w:type="spellStart"/>
-            <w:proofErr w:type="spellEnd"/>
-            <w:proofErr w:type="spellStart"/>
-            <w:proofErr w:type="spellEnd"/>
+            <w:tcW w:w="2689" w:type="dxa"/>
+            <w:tcBorders>
+              <w:top w:val="single" w:sz="4" w:space="0" w:color="888888"/>
+              <w:left w:val="single" w:sz="4" w:space="0" w:color="888888"/>
+              <w:bottom w:val="single" w:sz="4" w:space="0" w:color="888888"/>
+              <w:right w:val="single" w:sz="4" w:space="0" w:color="888888"/>
+            </w:tcBorders>
+            <w:tcMar>
+              <w:top w:w="100" w:type="dxa"/>
+              <w:left w:w="140" w:type="dxa"/>
+              <w:bottom w:w="100" w:type="dxa"/>
+              <w:right w:w="140" w:type="dxa"/>
+            </w:tcMar>
+          </w:tcPr>
+          <w:p>
             <w:r>
               <w:t>Label Sawit (probabilitas ≥ 0,5)</w:t>
             </w:r>
@@ -4402,7 +4322,7 @@
         </w:tc>
         <w:tc>
           <w:tcPr>
-            <w:tcW w:w="1500" w:type="dxa"/>
+            <w:tcW w:w="1186" w:type="dxa"/>
             <w:tcBorders>
               <w:top w:val="single" w:sz="4" w:space="0" w:color="888888"/>
               <w:left w:val="single" w:sz="4" w:space="0" w:color="888888"/>
@@ -4426,7 +4346,7 @@
       <w:tr>
         <w:tc>
           <w:tcPr>
-            <w:tcW w:type="dxa" w:w="664"/>
+            <w:tcW w:w="547" w:type="dxa"/>
           </w:tcPr>
           <w:p>
             <w:r>
@@ -4436,7 +4356,7 @@
         </w:tc>
         <w:tc>
           <w:tcPr>
-            <w:tcW w:type="dxa" w:w="1474"/>
+            <w:tcW w:w="1359" w:type="dxa"/>
           </w:tcPr>
           <w:p>
             <w:r>
@@ -4446,7 +4366,7 @@
         </w:tc>
         <w:tc>
           <w:tcPr>
-            <w:tcW w:type="dxa" w:w="4628"/>
+            <w:tcW w:w="4610" w:type="dxa"/>
           </w:tcPr>
           <w:p>
             <w:r>
@@ -4456,7 +4376,7 @@
         </w:tc>
         <w:tc>
           <w:tcPr>
-            <w:tcW w:type="dxa" w:w="1437"/>
+            <w:tcW w:w="2689" w:type="dxa"/>
           </w:tcPr>
           <w:p>
             <w:r>
@@ -4466,7 +4386,7 @@
         </w:tc>
         <w:tc>
           <w:tcPr>
-            <w:tcW w:type="dxa" w:w="1157"/>
+            <w:tcW w:w="1186" w:type="dxa"/>
           </w:tcPr>
           <w:p>
             <w:r>
@@ -4567,7 +4487,6 @@
         <w:rPr>
           <w:lang w:val="sv-SE"/>
         </w:rPr>
-        <w:lastRenderedPageBreak/>
         <w:t>Sentinel-2 adalah satelit pengamatan bumi milik program Copernicus (European Space Agency) yang menyediakan citra multispektral dengan resolusi spasial 10 meter dan revisit time 5 hari. Versi SR Harmonized adalah produk Level-2A yang sudah dikoreksi atmosferik, sehingga nilai pikselnya merepresentasikan reflektansi permukaan, bukan reflektansi di puncak atmosfer.</w:t>
       </w:r>
     </w:p>
@@ -4655,12 +4574,6 @@
         <w:gridCol w:w="5160"/>
       </w:tblGrid>
       <w:tr>
-        <w:tblPrEx>
-          <w:tblCellMar>
-            <w:top w:w="0" w:type="dxa"/>
-            <w:bottom w:w="0" w:type="dxa"/>
-          </w:tblCellMar>
-        </w:tblPrEx>
         <w:trPr>
           <w:tblHeader/>
         </w:trPr>
@@ -4814,12 +4727,6 @@
         </w:tc>
       </w:tr>
       <w:tr>
-        <w:tblPrEx>
-          <w:tblCellMar>
-            <w:top w:w="0" w:type="dxa"/>
-            <w:bottom w:w="0" w:type="dxa"/>
-          </w:tblCellMar>
-        </w:tblPrEx>
         <w:tc>
           <w:tcPr>
             <w:tcW w:w="1200" w:type="dxa"/>
@@ -4941,12 +4848,6 @@
         </w:tc>
       </w:tr>
       <w:tr>
-        <w:tblPrEx>
-          <w:tblCellMar>
-            <w:top w:w="0" w:type="dxa"/>
-            <w:bottom w:w="0" w:type="dxa"/>
-          </w:tblCellMar>
-        </w:tblPrEx>
         <w:tc>
           <w:tcPr>
             <w:tcW w:w="1200" w:type="dxa"/>
@@ -5028,12 +4929,6 @@
         </w:tc>
       </w:tr>
       <w:tr>
-        <w:tblPrEx>
-          <w:tblCellMar>
-            <w:top w:w="0" w:type="dxa"/>
-            <w:bottom w:w="0" w:type="dxa"/>
-          </w:tblCellMar>
-        </w:tblPrEx>
         <w:tc>
           <w:tcPr>
             <w:tcW w:w="1200" w:type="dxa"/>
@@ -5056,6 +4951,7 @@
                 <w:sz w:val="20"/>
                 <w:szCs w:val="20"/>
               </w:rPr>
+              <w:lastRenderedPageBreak/>
               <w:t>30</w:t>
             </w:r>
           </w:p>
@@ -5115,12 +5011,6 @@
         </w:tc>
       </w:tr>
       <w:tr>
-        <w:tblPrEx>
-          <w:tblCellMar>
-            <w:top w:w="0" w:type="dxa"/>
-            <w:bottom w:w="0" w:type="dxa"/>
-          </w:tblCellMar>
-        </w:tblPrEx>
         <w:tc>
           <w:tcPr>
             <w:tcW w:w="1200" w:type="dxa"/>
@@ -5202,12 +5092,6 @@
         </w:tc>
       </w:tr>
       <w:tr>
-        <w:tblPrEx>
-          <w:tblCellMar>
-            <w:top w:w="0" w:type="dxa"/>
-            <w:bottom w:w="0" w:type="dxa"/>
-          </w:tblCellMar>
-        </w:tblPrEx>
         <w:tc>
           <w:tcPr>
             <w:tcW w:w="1200" w:type="dxa"/>
@@ -5289,12 +5173,6 @@
         </w:tc>
       </w:tr>
       <w:tr>
-        <w:tblPrEx>
-          <w:tblCellMar>
-            <w:top w:w="0" w:type="dxa"/>
-            <w:bottom w:w="0" w:type="dxa"/>
-          </w:tblCellMar>
-        </w:tblPrEx>
         <w:tc>
           <w:tcPr>
             <w:tcW w:w="1200" w:type="dxa"/>
@@ -5376,12 +5254,6 @@
         </w:tc>
       </w:tr>
       <w:tr>
-        <w:tblPrEx>
-          <w:tblCellMar>
-            <w:top w:w="0" w:type="dxa"/>
-            <w:bottom w:w="0" w:type="dxa"/>
-          </w:tblCellMar>
-        </w:tblPrEx>
         <w:tc>
           <w:tcPr>
             <w:tcW w:w="1200" w:type="dxa"/>
@@ -5468,12 +5340,6 @@
         </w:tc>
       </w:tr>
       <w:tr>
-        <w:tblPrEx>
-          <w:tblCellMar>
-            <w:top w:w="0" w:type="dxa"/>
-            <w:bottom w:w="0" w:type="dxa"/>
-          </w:tblCellMar>
-        </w:tblPrEx>
         <w:tc>
           <w:tcPr>
             <w:tcW w:w="1200" w:type="dxa"/>
@@ -5611,12 +5477,6 @@
         </w:tc>
       </w:tr>
       <w:tr>
-        <w:tblPrEx>
-          <w:tblCellMar>
-            <w:top w:w="0" w:type="dxa"/>
-            <w:bottom w:w="0" w:type="dxa"/>
-          </w:tblCellMar>
-        </w:tblPrEx>
         <w:tc>
           <w:tcPr>
             <w:tcW w:w="1200" w:type="dxa"/>
@@ -5745,12 +5605,6 @@
         </w:tc>
       </w:tr>
       <w:tr>
-        <w:tblPrEx>
-          <w:tblCellMar>
-            <w:top w:w="0" w:type="dxa"/>
-            <w:bottom w:w="0" w:type="dxa"/>
-          </w:tblCellMar>
-        </w:tblPrEx>
         <w:tc>
           <w:tcPr>
             <w:tcW w:w="1200" w:type="dxa"/>
@@ -5837,12 +5691,6 @@
         </w:tc>
       </w:tr>
       <w:tr>
-        <w:tblPrEx>
-          <w:tblCellMar>
-            <w:top w:w="0" w:type="dxa"/>
-            <w:bottom w:w="0" w:type="dxa"/>
-          </w:tblCellMar>
-        </w:tblPrEx>
         <w:tc>
           <w:tcPr>
             <w:tcW w:w="1200" w:type="dxa"/>
@@ -6018,14 +5866,7 @@
         <w:rPr>
           <w:lang w:val="sv-SE"/>
         </w:rPr>
-        <w:t xml:space="preserve">Dataset ini diturunkan langsung dari Sentinel-2 L1C, sehingga grid pikselnya identik dengan Sentinel-2 — </w:t>
-      </w:r>
-      <w:r>
-        <w:rPr>
-          <w:lang w:val="sv-SE"/>
-        </w:rPr>
-        <w:lastRenderedPageBreak/>
-        <w:t>keuntungan besar untuk konsistensi label. Tersedia dari 2015 hingga saat ini, diperbarui setiap kali ada citra Sentinel-2 baru.</w:t>
+        <w:t>Dataset ini diturunkan langsung dari Sentinel-2 L1C, sehingga grid pikselnya identik dengan Sentinel-2 — keuntungan besar untuk konsistensi label. Tersedia dari 2015 hingga saat ini, diperbarui setiap kali ada citra Sentinel-2 baru.</w:t>
       </w:r>
     </w:p>
     <w:p>
@@ -6037,6 +5878,9 @@
         </w:rPr>
       </w:pPr>
       <w:r>
+        <w:rPr>
+          <w:lang w:val="sv-SE"/>
+        </w:rPr>
         <w:t>Dynamic World berperan sebagai PETA DASAR label dalam proyek ini. Sembilan kelas DW di-remap ke 7 kelas proyek melalui tabel DW_TO_CLASS (lihat tabel di bawah). Pendekatan ini menggantikan metode lama (irisan ketat ESA AND DW) yang menyebabkan hutan tidak teridentifikasi secara benar karena piksel yang tidak disepakati kedua sumber jatuh ke kelas Pertanian Lain.</w:t>
       </w:r>
     </w:p>
@@ -6112,12 +5956,6 @@
         <w:gridCol w:w="5160"/>
       </w:tblGrid>
       <w:tr>
-        <w:tblPrEx>
-          <w:tblCellMar>
-            <w:top w:w="0" w:type="dxa"/>
-            <w:bottom w:w="0" w:type="dxa"/>
-          </w:tblCellMar>
-        </w:tblPrEx>
         <w:trPr>
           <w:tblHeader/>
         </w:trPr>
@@ -6260,12 +6098,6 @@
         </w:tc>
       </w:tr>
       <w:tr>
-        <w:tblPrEx>
-          <w:tblCellMar>
-            <w:top w:w="0" w:type="dxa"/>
-            <w:bottom w:w="0" w:type="dxa"/>
-          </w:tblCellMar>
-        </w:tblPrEx>
         <w:tc>
           <w:tcPr>
             <w:tcW w:w="1200" w:type="dxa"/>
@@ -6387,12 +6219,6 @@
         </w:tc>
       </w:tr>
       <w:tr>
-        <w:tblPrEx>
-          <w:tblCellMar>
-            <w:top w:w="0" w:type="dxa"/>
-            <w:bottom w:w="0" w:type="dxa"/>
-          </w:tblCellMar>
-        </w:tblPrEx>
         <w:tc>
           <w:tcPr>
             <w:tcW w:w="1200" w:type="dxa"/>
@@ -6498,12 +6324,6 @@
         </w:tc>
       </w:tr>
       <w:tr>
-        <w:tblPrEx>
-          <w:tblCellMar>
-            <w:top w:w="0" w:type="dxa"/>
-            <w:bottom w:w="0" w:type="dxa"/>
-          </w:tblCellMar>
-        </w:tblPrEx>
         <w:tc>
           <w:tcPr>
             <w:tcW w:w="1200" w:type="dxa"/>
@@ -6634,12 +6454,6 @@
         </w:tc>
       </w:tr>
       <w:tr>
-        <w:tblPrEx>
-          <w:tblCellMar>
-            <w:top w:w="0" w:type="dxa"/>
-            <w:bottom w:w="0" w:type="dxa"/>
-          </w:tblCellMar>
-        </w:tblPrEx>
         <w:tc>
           <w:tcPr>
             <w:tcW w:w="1200" w:type="dxa"/>
@@ -6777,12 +6591,6 @@
         </w:tc>
       </w:tr>
       <w:tr>
-        <w:tblPrEx>
-          <w:tblCellMar>
-            <w:top w:w="0" w:type="dxa"/>
-            <w:bottom w:w="0" w:type="dxa"/>
-          </w:tblCellMar>
-        </w:tblPrEx>
         <w:tc>
           <w:tcPr>
             <w:tcW w:w="1200" w:type="dxa"/>
@@ -6869,12 +6677,6 @@
         </w:tc>
       </w:tr>
       <w:tr>
-        <w:tblPrEx>
-          <w:tblCellMar>
-            <w:top w:w="0" w:type="dxa"/>
-            <w:bottom w:w="0" w:type="dxa"/>
-          </w:tblCellMar>
-        </w:tblPrEx>
         <w:tc>
           <w:tcPr>
             <w:tcW w:w="1200" w:type="dxa"/>
@@ -7005,12 +6807,6 @@
         </w:tc>
       </w:tr>
       <w:tr>
-        <w:tblPrEx>
-          <w:tblCellMar>
-            <w:top w:w="0" w:type="dxa"/>
-            <w:bottom w:w="0" w:type="dxa"/>
-          </w:tblCellMar>
-        </w:tblPrEx>
         <w:tc>
           <w:tcPr>
             <w:tcW w:w="1200" w:type="dxa"/>
@@ -7141,12 +6937,6 @@
         </w:tc>
       </w:tr>
       <w:tr>
-        <w:tblPrEx>
-          <w:tblCellMar>
-            <w:top w:w="0" w:type="dxa"/>
-            <w:bottom w:w="0" w:type="dxa"/>
-          </w:tblCellMar>
-        </w:tblPrEx>
         <w:tc>
           <w:tcPr>
             <w:tcW w:w="1200" w:type="dxa"/>
@@ -7252,12 +7042,6 @@
         </w:tc>
       </w:tr>
       <w:tr>
-        <w:tblPrEx>
-          <w:tblCellMar>
-            <w:top w:w="0" w:type="dxa"/>
-            <w:bottom w:w="0" w:type="dxa"/>
-          </w:tblCellMar>
-        </w:tblPrEx>
         <w:tc>
           <w:tcPr>
             <w:tcW w:w="1200" w:type="dxa"/>
@@ -7353,6 +7137,10 @@
         </w:rPr>
       </w:pPr>
       <w:r>
+        <w:rPr>
+          <w:lang w:val="sv-SE"/>
+        </w:rPr>
+        <w:lastRenderedPageBreak/>
         <w:t>Dynamic World diproduksi menggunakan Sentinel-2 Level 1C, resolusi 10 meter, tersedia hampir real-time (2–5 hari setelah akuisisi citra). Untuk proyek ini dipakai mode tahunan (`.mode()` per tahun T2=2025) agar mendapatkan kelas yang paling sering muncul di tiap piksel sepanjang tahun, mengurangi dampak awan sementara.</w:t>
       </w:r>
     </w:p>
@@ -7410,12 +7198,6 @@
         <w:gridCol w:w="4560"/>
       </w:tblGrid>
       <w:tr>
-        <w:tblPrEx>
-          <w:tblCellMar>
-            <w:top w:w="0" w:type="dxa"/>
-            <w:bottom w:w="0" w:type="dxa"/>
-          </w:tblCellMar>
-        </w:tblPrEx>
         <w:trPr>
           <w:tblHeader/>
         </w:trPr>
@@ -7547,12 +7329,6 @@
         </w:tc>
       </w:tr>
       <w:tr>
-        <w:tblPrEx>
-          <w:tblCellMar>
-            <w:top w:w="0" w:type="dxa"/>
-            <w:bottom w:w="0" w:type="dxa"/>
-          </w:tblCellMar>
-        </w:tblPrEx>
         <w:tc>
           <w:tcPr>
             <w:tcW w:w="1800" w:type="dxa"/>
@@ -7680,12 +7456,6 @@
         </w:tc>
       </w:tr>
       <w:tr>
-        <w:tblPrEx>
-          <w:tblCellMar>
-            <w:top w:w="0" w:type="dxa"/>
-            <w:bottom w:w="0" w:type="dxa"/>
-          </w:tblCellMar>
-        </w:tblPrEx>
         <w:tc>
           <w:tcPr>
             <w:tcW w:w="1800" w:type="dxa"/>
@@ -7769,18 +7539,15 @@
               </w:rPr>
             </w:pPr>
             <w:r>
+              <w:rPr>
+                <w:lang w:val="sv-SE"/>
+              </w:rPr>
               <w:t>Sumber utama Kelas 2 (Lahan Terbuka): piksel dengan lossyear lebih dari 18 (kehilangan sejak 2019)</w:t>
             </w:r>
           </w:p>
         </w:tc>
       </w:tr>
       <w:tr>
-        <w:tblPrEx>
-          <w:tblCellMar>
-            <w:top w:w="0" w:type="dxa"/>
-            <w:bottom w:w="0" w:type="dxa"/>
-          </w:tblCellMar>
-        </w:tblPrEx>
         <w:tc>
           <w:tcPr>
             <w:tcW w:w="1800" w:type="dxa"/>
@@ -7892,12 +7659,6 @@
         </w:tc>
       </w:tr>
       <w:tr>
-        <w:tblPrEx>
-          <w:tblCellMar>
-            <w:top w:w="0" w:type="dxa"/>
-            <w:bottom w:w="0" w:type="dxa"/>
-          </w:tblCellMar>
-        </w:tblPrEx>
         <w:tc>
           <w:tcPr>
             <w:tcW w:w="1800" w:type="dxa"/>
@@ -8019,7 +7780,6 @@
           <w:bCs/>
           <w:lang w:val="sv-SE"/>
         </w:rPr>
-        <w:lastRenderedPageBreak/>
         <w:t xml:space="preserve">Keterbatasan Hansen — resolusi 30 meter: </w:t>
       </w:r>
       <w:r>
@@ -8055,9 +7815,6 @@
     <w:p>
       <w:pPr>
         <w:pStyle w:val="Heading3"/>
-        <w:rPr>
-          <w:lang w:val="sv-SE"/>
-        </w:rPr>
       </w:pPr>
       <w:bookmarkStart w:id="10" w:name="_Toc231018774"/>
       <w:bookmarkEnd w:id="10"/>
@@ -8070,14 +7827,6 @@
         <w:spacing w:after="120" w:line="320" w:lineRule="auto"/>
         <w:jc w:val="both"/>
       </w:pPr>
-      <w:proofErr w:type="spellStart"/>
-      <w:proofErr w:type="spellEnd"/>
-      <w:proofErr w:type="spellStart"/>
-      <w:proofErr w:type="spellEnd"/>
-      <w:proofErr w:type="spellStart"/>
-      <w:proofErr w:type="spellEnd"/>
-      <w:proofErr w:type="spellStart"/>
-      <w:proofErr w:type="spellEnd"/>
       <w:r>
         <w:t>Forest Data Partnership (FDP) Palm Probability Model 2025a adalah produk pemetaan sawit berbasis kecerdasan buatan dari Google dan FAO, tersedia sebagai aset Google Earth Engine native. Dataset ini menyediakan band "probability" (0–1) yang merepresentasikan probabilitas per piksel bahwa area tersebut merupakan perkebunan kelapa sawit, dengan resolusi 10 meter dan coverage mencakup Indonesia termasuk Papua. Ambang klasifikasi yang digunakan dalam proyek ini adalah probability ≥ 0,5.</w:t>
       </w:r>
@@ -8105,12 +7854,6 @@
         <w:gridCol w:w="5160"/>
       </w:tblGrid>
       <w:tr>
-        <w:tblPrEx>
-          <w:tblCellMar>
-            <w:top w:w="0" w:type="dxa"/>
-            <w:bottom w:w="0" w:type="dxa"/>
-          </w:tblCellMar>
-        </w:tblPrEx>
         <w:trPr>
           <w:tblHeader/>
         </w:trPr>
@@ -8253,12 +7996,6 @@
         </w:tc>
       </w:tr>
       <w:tr>
-        <w:tblPrEx>
-          <w:tblCellMar>
-            <w:top w:w="0" w:type="dxa"/>
-            <w:bottom w:w="0" w:type="dxa"/>
-          </w:tblCellMar>
-        </w:tblPrEx>
         <w:tc>
           <w:tcPr>
             <w:tcW w:w="1200" w:type="dxa"/>
@@ -8380,12 +8117,6 @@
         </w:tc>
       </w:tr>
       <w:tr>
-        <w:tblPrEx>
-          <w:tblCellMar>
-            <w:top w:w="0" w:type="dxa"/>
-            <w:bottom w:w="0" w:type="dxa"/>
-          </w:tblCellMar>
-        </w:tblPrEx>
         <w:tc>
           <w:tcPr>
             <w:tcW w:w="1200" w:type="dxa"/>
@@ -8408,6 +8139,7 @@
                 <w:sz w:val="20"/>
                 <w:szCs w:val="20"/>
               </w:rPr>
+              <w:lastRenderedPageBreak/>
               <w:t>2</w:t>
             </w:r>
           </w:p>
@@ -8507,12 +8239,6 @@
         </w:tc>
       </w:tr>
       <w:tr>
-        <w:tblPrEx>
-          <w:tblCellMar>
-            <w:top w:w="0" w:type="dxa"/>
-            <w:bottom w:w="0" w:type="dxa"/>
-          </w:tblCellMar>
-        </w:tblPrEx>
         <w:tc>
           <w:tcPr>
             <w:tcW w:w="1200" w:type="dxa"/>
@@ -8834,47 +8560,79 @@
         </w:rPr>
       </w:pPr>
       <w:r>
+        <w:rPr>
+          <w:lang w:val="sv-SE"/>
+        </w:rPr>
         <w:t>Keterbatasan FDP Palm 2025a: model probabilistik dengan ambang 0,5 dapat melewatkan sawit muda (kanopi belum menutup, sinyal Sentinel-1 lemah) dan mungkin over-predict di area vegetasi lebat yang mirip pola sawit. Sawit muda (0–3 tahun) tetap sulit terdeteksi — ini adalah keterbatasan fisik sensor yang tidak bergantung pada dataset sumber.</w:t>
       </w:r>
     </w:p>
     <w:p>
       <w:pPr>
         <w:pStyle w:val="Heading3"/>
+        <w:rPr>
+          <w:lang w:val="sv-SE"/>
+        </w:rPr>
       </w:pPr>
       <w:r>
+        <w:rPr>
+          <w:lang w:val="sv-SE"/>
+        </w:rPr>
         <w:t>Dataset 6 — Global Mining Footprint (Sumber Label Tambang)</w:t>
       </w:r>
     </w:p>
     <w:p>
-      <w:r>
+      <w:pPr>
+        <w:rPr>
+          <w:lang w:val="sv-SE"/>
+        </w:rPr>
+      </w:pPr>
+      <w:r>
+        <w:rPr>
+          <w:lang w:val="sv-SE"/>
+        </w:rPr>
         <w:t>Sumber label Tambang adalah gabungan (union) dua produk footprint tambang global beresolusi tinggi: Global Mining Footprint (Tang &amp; Werner 2023, berbasis Sentinel-2 ~2019) dan Global Mining Polygons (Maus dkk. 2022). Keduanya memetakan lahan yang BENAR-BENAR tergali (pit, tailing, waste rock, infrastruktur) — bukan konsesi/izin. Penggabungan melengkapi cakupan yang saling terlewat; di Papua menghasilkan ~5.569 ha (27 poligon), termasuk kompleks Grasberg/Timika.</w:t>
       </w:r>
     </w:p>
     <w:p>
-      <w:r>
+      <w:pPr>
+        <w:rPr>
+          <w:lang w:val="sv-SE"/>
+        </w:rPr>
+      </w:pPr>
+      <w:r>
+        <w:rPr>
+          <w:lang w:val="sv-SE"/>
+        </w:rPr>
         <w:t>Dalam proyek ini, poligon tambang dirasterisasi dengan fungsi ee.Image().paint() menjadi mask biner, kemudian diterapkan sebagai overlay tematik pada label fusion (langkah ke-4, menimpa peta dasar Dynamic World) untuk menghasilkan Kelas 5 (Tambang).</w:t>
       </w:r>
     </w:p>
     <w:p>
-      <w:r>
+      <w:pPr>
+        <w:rPr>
+          <w:lang w:val="sv-SE"/>
+        </w:rPr>
+      </w:pPr>
+      <w:r>
+        <w:rPr>
+          <w:lang w:val="sv-SE"/>
+        </w:rPr>
         <w:t>Prinsip dan keterbatasan: footprint (~2019) berperan sebagai "guru lokasi" — model ResNet50-U-Net mempelajari pola/tanda spektral tambang dari citra Sentinel-2 2025 di lokasi yang diketahui, sehingga saat inferensi dapat menandai tambang serupa yang belum terdata. Namun footprint global tetap under-capture tambang Papua: bahkan kompleks Grasberg hanya tertangkap sebagian, dan tambang emas rakyat/ilegal yang tersebar sulit dipetakan dataset global mana pun. Penting: angka Tambang dari model TIDAK akan menyamai luas konsesi (~1,2 juta ha) — konsesi mayoritas masih hutan berizin, bukan lahan tergali. Kelas Tambang dilaporkan apa adanya sebagai kelas dengan keterbatasan data yang diakui terbuka.</w:t>
       </w:r>
     </w:p>
     <w:p>
       <w:pPr>
         <w:pStyle w:val="Heading2"/>
-        <w:rPr>
-          <w:lang w:val="sv-SE"/>
-        </w:rPr>
       </w:pPr>
       <w:bookmarkStart w:id="11" w:name="_Toc231018775"/>
       <w:r>
-        <w:rPr>
-          <w:lang w:val="sv-SE"/>
-        </w:rPr>
-        <w:t>3.3. Strategi Label Fusion dan Consensus Labeling</w:t>
+        <w:t xml:space="preserve">3.3. Strategi Label Fusion dan Consensus </w:t>
+      </w:r>
+      <w:proofErr w:type="spellStart"/>
+      <w:r>
+        <w:t>Labeling</w:t>
       </w:r>
       <w:bookmarkEnd w:id="11"/>
+      <w:proofErr w:type="spellEnd"/>
     </w:p>
     <w:p>
       <w:pPr>
@@ -8885,17 +8643,181 @@
         </w:rPr>
       </w:pPr>
       <w:r>
-        <w:rPr>
-          <w:lang w:val="sv-SE"/>
-        </w:rPr>
-        <w:t xml:space="preserve">Karena tidak ada satu dataset yang menyediakan ketujuh kelas yang diinginkan secara langsung, proyek ini menggunakan strategi label fusion — menggabungkan informasi dari </w:t>
-      </w:r>
-      <w:r>
-        <w:rPr>
-          <w:lang w:val="sv-SE"/>
-        </w:rPr>
-        <w:lastRenderedPageBreak/>
-        <w:t>beberapa sumber untuk menghasilkan label berkualitas tinggi. Empat aturan fusi berikut diterapkan secara berurutan saat membuat label di GEE:</w:t>
+        <w:t xml:space="preserve">Karena </w:t>
+      </w:r>
+      <w:proofErr w:type="spellStart"/>
+      <w:r>
+        <w:t>tidak</w:t>
+      </w:r>
+      <w:proofErr w:type="spellEnd"/>
+      <w:r>
+        <w:t xml:space="preserve"> </w:t>
+      </w:r>
+      <w:proofErr w:type="spellStart"/>
+      <w:r>
+        <w:t>ada</w:t>
+      </w:r>
+      <w:proofErr w:type="spellEnd"/>
+      <w:r>
+        <w:t xml:space="preserve"> </w:t>
+      </w:r>
+      <w:proofErr w:type="spellStart"/>
+      <w:r>
+        <w:t>satu</w:t>
+      </w:r>
+      <w:proofErr w:type="spellEnd"/>
+      <w:r>
+        <w:t xml:space="preserve"> dataset yang </w:t>
+      </w:r>
+      <w:proofErr w:type="spellStart"/>
+      <w:r>
+        <w:t>menyediakan</w:t>
+      </w:r>
+      <w:proofErr w:type="spellEnd"/>
+      <w:r>
+        <w:t xml:space="preserve"> </w:t>
+      </w:r>
+      <w:proofErr w:type="spellStart"/>
+      <w:r>
+        <w:t>ketujuh</w:t>
+      </w:r>
+      <w:proofErr w:type="spellEnd"/>
+      <w:r>
+        <w:t xml:space="preserve"> </w:t>
+      </w:r>
+      <w:proofErr w:type="spellStart"/>
+      <w:r>
+        <w:t>kelas</w:t>
+      </w:r>
+      <w:proofErr w:type="spellEnd"/>
+      <w:r>
+        <w:t xml:space="preserve"> yang </w:t>
+      </w:r>
+      <w:proofErr w:type="spellStart"/>
+      <w:r>
+        <w:t>diinginkan</w:t>
+      </w:r>
+      <w:proofErr w:type="spellEnd"/>
+      <w:r>
+        <w:t xml:space="preserve"> </w:t>
+      </w:r>
+      <w:proofErr w:type="spellStart"/>
+      <w:r>
+        <w:t>secara</w:t>
+      </w:r>
+      <w:proofErr w:type="spellEnd"/>
+      <w:r>
+        <w:t xml:space="preserve"> </w:t>
+      </w:r>
+      <w:proofErr w:type="spellStart"/>
+      <w:r>
+        <w:t>langsung</w:t>
+      </w:r>
+      <w:proofErr w:type="spellEnd"/>
+      <w:r>
+        <w:t xml:space="preserve">, </w:t>
+      </w:r>
+      <w:proofErr w:type="spellStart"/>
+      <w:r>
+        <w:t>proyek</w:t>
+      </w:r>
+      <w:proofErr w:type="spellEnd"/>
+      <w:r>
+        <w:t xml:space="preserve"> </w:t>
+      </w:r>
+      <w:proofErr w:type="spellStart"/>
+      <w:r>
+        <w:t>ini</w:t>
+      </w:r>
+      <w:proofErr w:type="spellEnd"/>
+      <w:r>
+        <w:t xml:space="preserve"> </w:t>
+      </w:r>
+      <w:proofErr w:type="spellStart"/>
+      <w:r>
+        <w:t>menggunakan</w:t>
+      </w:r>
+      <w:proofErr w:type="spellEnd"/>
+      <w:r>
+        <w:t xml:space="preserve"> strategi label fusion — </w:t>
+      </w:r>
+      <w:proofErr w:type="spellStart"/>
+      <w:r>
+        <w:t>menggabungkan</w:t>
+      </w:r>
+      <w:proofErr w:type="spellEnd"/>
+      <w:r>
+        <w:t xml:space="preserve"> </w:t>
+      </w:r>
+      <w:proofErr w:type="spellStart"/>
+      <w:r>
+        <w:t>informasi</w:t>
+      </w:r>
+      <w:proofErr w:type="spellEnd"/>
+      <w:r>
+        <w:t xml:space="preserve"> </w:t>
+      </w:r>
+      <w:proofErr w:type="spellStart"/>
+      <w:r>
+        <w:t>dari</w:t>
+      </w:r>
+      <w:proofErr w:type="spellEnd"/>
+      <w:r>
+        <w:t xml:space="preserve"> </w:t>
+      </w:r>
+      <w:proofErr w:type="spellStart"/>
+      <w:r>
+        <w:t>beberapa</w:t>
+      </w:r>
+      <w:proofErr w:type="spellEnd"/>
+      <w:r>
+        <w:t xml:space="preserve"> </w:t>
+      </w:r>
+      <w:proofErr w:type="spellStart"/>
+      <w:r>
+        <w:t>sumber</w:t>
+      </w:r>
+      <w:proofErr w:type="spellEnd"/>
+      <w:r>
+        <w:t xml:space="preserve"> </w:t>
+      </w:r>
+      <w:proofErr w:type="spellStart"/>
+      <w:r>
+        <w:t>untuk</w:t>
+      </w:r>
+      <w:proofErr w:type="spellEnd"/>
+      <w:r>
+        <w:t xml:space="preserve"> </w:t>
+      </w:r>
+      <w:proofErr w:type="spellStart"/>
+      <w:r>
+        <w:t>menghasilkan</w:t>
+      </w:r>
+      <w:proofErr w:type="spellEnd"/>
+      <w:r>
+        <w:t xml:space="preserve"> label </w:t>
+      </w:r>
+      <w:proofErr w:type="spellStart"/>
+      <w:r>
+        <w:t>berkualitas</w:t>
+      </w:r>
+      <w:proofErr w:type="spellEnd"/>
+      <w:r>
+        <w:t xml:space="preserve"> </w:t>
+      </w:r>
+      <w:proofErr w:type="spellStart"/>
+      <w:r>
+        <w:t>tinggi</w:t>
+      </w:r>
+      <w:proofErr w:type="spellEnd"/>
+      <w:r>
+        <w:t xml:space="preserve">. </w:t>
+      </w:r>
+      <w:r>
+        <w:rPr>
+          <w:lang w:val="sv-SE"/>
+        </w:rPr>
+        <w:t>Empat aturan fusi berikut diterapkan secara berurutan saat membuat label di GEE:</w:t>
       </w:r>
     </w:p>
     <w:tbl>
@@ -8916,17 +8838,11 @@
         <w:tblLook w:val="04A0" w:firstRow="1" w:lastRow="0" w:firstColumn="1" w:lastColumn="0" w:noHBand="0" w:noVBand="1"/>
       </w:tblPr>
       <w:tblGrid>
-        <w:gridCol w:w="925"/>
-        <w:gridCol w:w="4435"/>
-        <w:gridCol w:w="4000"/>
+        <w:gridCol w:w="929"/>
+        <w:gridCol w:w="4460"/>
+        <w:gridCol w:w="3971"/>
       </w:tblGrid>
       <w:tr>
-        <w:tblPrEx>
-          <w:tblCellMar>
-            <w:top w:w="0" w:type="dxa"/>
-            <w:bottom w:w="0" w:type="dxa"/>
-          </w:tblCellMar>
-        </w:tblPrEx>
         <w:trPr>
           <w:tblHeader/>
         </w:trPr>
@@ -8947,8 +8863,6 @@
             </w:tcMar>
           </w:tcPr>
           <w:p>
-            <w:proofErr w:type="spellStart"/>
-            <w:proofErr w:type="spellEnd"/>
             <w:r>
               <w:t>Aturan</w:t>
             </w:r>
@@ -8971,8 +8885,6 @@
             </w:tcMar>
           </w:tcPr>
           <w:p>
-            <w:proofErr w:type="spellStart"/>
-            <w:proofErr w:type="spellEnd"/>
             <w:r>
               <w:t>Langkah / Kondisi</w:t>
             </w:r>
@@ -9002,12 +8914,6 @@
         </w:tc>
       </w:tr>
       <w:tr>
-        <w:tblPrEx>
-          <w:tblCellMar>
-            <w:top w:w="0" w:type="dxa"/>
-            <w:bottom w:w="0" w:type="dxa"/>
-          </w:tblCellMar>
-        </w:tblPrEx>
         <w:tc>
           <w:tcPr>
             <w:tcW w:w="800" w:type="dxa"/>
@@ -9047,12 +8953,12 @@
             </w:tcMar>
           </w:tcPr>
           <w:p>
-            <w:proofErr w:type="spellStart"/>
-            <w:proofErr w:type="spellEnd"/>
-            <w:proofErr w:type="spellStart"/>
-            <w:proofErr w:type="spellEnd"/>
-            <w:r>
-              <w:t>Dynamic World (mode tahunan 2025), remap 9→7 kelas: Water/Flooded→Perairan | Trees→Hutan | Grass/Crops/Shrub→Pertanian Lain | Built→Permukiman | Bare/Snow→Lahan Terbuka</w:t>
+            <w:r>
+              <w:t xml:space="preserve">Dynamic World (mode tahunan 2025), remap 9→7 kelas: </w:t>
+            </w:r>
+            <w:r>
+              <w:lastRenderedPageBreak/>
+              <w:t>Water/Flooded→Perairan | Trees→Hutan | Grass/Crops/Shrub→Pertanian Lain | Built→Permukiman | Bare/Snow→Lahan Terbuka</w:t>
             </w:r>
           </w:p>
         </w:tc>
@@ -9073,23 +8979,22 @@
             </w:tcMar>
           </w:tcPr>
           <w:p>
-            <w:proofErr w:type="spellStart"/>
-            <w:proofErr w:type="spellEnd"/>
-            <w:proofErr w:type="spellStart"/>
-            <w:proofErr w:type="spellEnd"/>
-            <w:r>
+            <w:pPr>
+              <w:rPr>
+                <w:lang w:val="sv-SE"/>
+              </w:rPr>
+            </w:pPr>
+            <w:r>
+              <w:rPr>
+                <w:lang w:val="sv-SE"/>
+              </w:rPr>
+              <w:lastRenderedPageBreak/>
               <w:t>PETA DASAR — semua piksel terisi (tidak ada default Pertanian Lain)</w:t>
             </w:r>
           </w:p>
         </w:tc>
       </w:tr>
       <w:tr>
-        <w:tblPrEx>
-          <w:tblCellMar>
-            <w:top w:w="0" w:type="dxa"/>
-            <w:bottom w:w="0" w:type="dxa"/>
-          </w:tblCellMar>
-        </w:tblPrEx>
         <w:tc>
           <w:tcPr>
             <w:tcW w:w="800" w:type="dxa"/>
@@ -9129,10 +9034,6 @@
             </w:tcMar>
           </w:tcPr>
           <w:p>
-            <w:proofErr w:type="spellStart"/>
-            <w:proofErr w:type="spellEnd"/>
-            <w:proofErr w:type="spellStart"/>
-            <w:proofErr w:type="spellEnd"/>
             <w:r>
               <w:t>(Opsional) ESA WorldCover = 10 (Tree cover) AND piksel DW trees/grass/shrub → promosikan ke Hutan (UNION — hanya menambah, tidak menghapus)</w:t>
             </w:r>
@@ -9155,21 +9056,21 @@
             </w:tcMar>
           </w:tcPr>
           <w:p>
-            <w:proofErr w:type="spellStart"/>
-            <w:proofErr w:type="spellEnd"/>
-            <w:r>
+            <w:pPr>
+              <w:rPr>
+                <w:lang w:val="sv-SE"/>
+              </w:rPr>
+            </w:pPr>
+            <w:r>
+              <w:rPr>
+                <w:lang w:val="sv-SE"/>
+              </w:rPr>
               <w:t>Kelas 1 — Hutan (perkuat dari ESA)</w:t>
             </w:r>
           </w:p>
         </w:tc>
       </w:tr>
       <w:tr>
-        <w:tblPrEx>
-          <w:tblCellMar>
-            <w:top w:w="0" w:type="dxa"/>
-            <w:bottom w:w="0" w:type="dxa"/>
-          </w:tblCellMar>
-        </w:tblPrEx>
         <w:tc>
           <w:tcPr>
             <w:tcW w:w="800" w:type="dxa"/>
@@ -9209,14 +9110,30 @@
             </w:tcMar>
           </w:tcPr>
           <w:p>
-            <w:pPr>
-              <w:rPr>
-                <w:lang w:val="sv-SE"/>
-              </w:rPr>
-            </w:pPr>
-            <w:r>
-              <w:t>Hansen GFC lossyear ≥ 19 (kehilangan hutan sejak 2019), setelah morphological erosion 1 piksel untuk mengurangi noise tepi</w:t>
-            </w:r>
+            <w:r>
+              <w:t xml:space="preserve">Hansen GFC lossyear ≥ 19 (kehilangan hutan sejak 2019), setelah morphological erosion 1 piksel </w:t>
+            </w:r>
+            <w:proofErr w:type="spellStart"/>
+            <w:r>
+              <w:t>untuk</w:t>
+            </w:r>
+            <w:proofErr w:type="spellEnd"/>
+            <w:r>
+              <w:t xml:space="preserve"> </w:t>
+            </w:r>
+            <w:proofErr w:type="spellStart"/>
+            <w:r>
+              <w:t>mengurangi</w:t>
+            </w:r>
+            <w:proofErr w:type="spellEnd"/>
+            <w:r>
+              <w:t xml:space="preserve"> noise </w:t>
+            </w:r>
+            <w:proofErr w:type="spellStart"/>
+            <w:r>
+              <w:t>tepi</w:t>
+            </w:r>
+            <w:proofErr w:type="spellEnd"/>
           </w:p>
         </w:tc>
         <w:tc>
@@ -9237,22 +9154,17 @@
           </w:tcPr>
           <w:p>
             <w:proofErr w:type="spellStart"/>
-            <w:proofErr w:type="spellEnd"/>
-            <w:proofErr w:type="spellStart"/>
-            <w:proofErr w:type="spellEnd"/>
-            <w:r>
-              <w:t>Kelas 2 — Lahan Terbuka (MENIMPA)</w:t>
+            <w:r>
+              <w:t>Kelas</w:t>
+            </w:r>
+            <w:proofErr w:type="spellEnd"/>
+            <w:r>
+              <w:t xml:space="preserve"> 2 — Lahan Terbuka (MENIMPA)</w:t>
             </w:r>
           </w:p>
         </w:tc>
       </w:tr>
       <w:tr>
-        <w:tblPrEx>
-          <w:tblCellMar>
-            <w:top w:w="0" w:type="dxa"/>
-            <w:bottom w:w="0" w:type="dxa"/>
-          </w:tblCellMar>
-        </w:tblPrEx>
         <w:tc>
           <w:tcPr>
             <w:tcW w:w="800" w:type="dxa"/>
@@ -9292,8 +9204,6 @@
             </w:tcMar>
           </w:tcPr>
           <w:p>
-            <w:proofErr w:type="spellStart"/>
-            <w:proofErr w:type="spellEnd"/>
             <w:r>
               <w:t>Poligon Global Mining Footprint (union Tang &amp; Werner 2023 + Maus dkk. 2022) dirasterisasi dengan ee.Image().paint()</w:t>
             </w:r>
@@ -9316,10 +9226,6 @@
             </w:tcMar>
           </w:tcPr>
           <w:p>
-            <w:proofErr w:type="spellStart"/>
-            <w:proofErr w:type="spellEnd"/>
-            <w:proofErr w:type="spellStart"/>
-            <w:proofErr w:type="spellEnd"/>
             <w:r>
               <w:t>Kelas 5 — Tambang (MENIMPA)</w:t>
             </w:r>
@@ -9327,12 +9233,6 @@
         </w:tc>
       </w:tr>
       <w:tr>
-        <w:tblPrEx>
-          <w:tblCellMar>
-            <w:top w:w="0" w:type="dxa"/>
-            <w:bottom w:w="0" w:type="dxa"/>
-          </w:tblCellMar>
-        </w:tblPrEx>
         <w:tc>
           <w:tcPr>
             <w:tcW w:w="800" w:type="dxa"/>
@@ -9372,8 +9272,6 @@
             </w:tcMar>
           </w:tcPr>
           <w:p>
-            <w:proofErr w:type="spellStart"/>
-            <w:proofErr w:type="spellEnd"/>
             <w:r>
               <w:t>FDP Palm Probability model 2025a: probability ≥ 0,5 (diterapkan PALING AKHIR agar kelas Sawit pasti terwakili)</w:t>
             </w:r>
@@ -9396,10 +9294,6 @@
             </w:tcMar>
           </w:tcPr>
           <w:p>
-            <w:proofErr w:type="spellStart"/>
-            <w:proofErr w:type="spellEnd"/>
-            <w:proofErr w:type="spellStart"/>
-            <w:proofErr w:type="spellEnd"/>
             <w:r>
               <w:t>Kelas 3 — Sawit (MENIMPA, prioritas tertinggi)</w:t>
             </w:r>
@@ -9415,32 +9309,14 @@
           <w:lang w:val="sv-SE"/>
         </w:rPr>
       </w:pPr>
-      <w:proofErr w:type="spellStart"/>
-      <w:proofErr w:type="spellEnd"/>
-      <w:proofErr w:type="spellStart"/>
-      <w:proofErr w:type="spellEnd"/>
-      <w:proofErr w:type="spellStart"/>
-      <w:proofErr w:type="spellEnd"/>
-      <w:proofErr w:type="spellStart"/>
-      <w:proofErr w:type="spellEnd"/>
-      <w:proofErr w:type="spellStart"/>
-      <w:proofErr w:type="spellEnd"/>
-      <w:proofErr w:type="spellStart"/>
-      <w:proofErr w:type="spellEnd"/>
-      <w:proofErr w:type="spellStart"/>
-      <w:proofErr w:type="spellEnd"/>
-      <w:proofErr w:type="spellStart"/>
-      <w:proofErr w:type="spellEnd"/>
-      <w:proofErr w:type="spellStart"/>
-      <w:proofErr w:type="spellEnd"/>
-      <w:proofErr w:type="spellStart"/>
-      <w:proofErr w:type="spellEnd"/>
-      <w:proofErr w:type="spellStart"/>
-      <w:proofErr w:type="spellEnd"/>
-      <w:proofErr w:type="spellStart"/>
-      <w:proofErr w:type="spellEnd"/>
-      <w:r>
-        <w:t>Tiap piksel Papua mendapat kelas dari DW terlebih dahulu (peta dasar lengkap), kemudian overlay tematik diterapkan berurutan: Hansen → Lahan Terbuka, Mining → Tambang, FDP Palm → Sawit (terakhir, pasti terwakili). Sentinel-2 tetap berperan sebagai INPUT model, bukan sumber label.</w:t>
+      <w:r>
+        <w:t xml:space="preserve">Tiap piksel Papua mendapat kelas dari DW terlebih dahulu (peta dasar lengkap), kemudian overlay tematik diterapkan berurutan: Hansen → Lahan Terbuka, Mining → Tambang, FDP Palm → Sawit (terakhir, pasti terwakili). </w:t>
+      </w:r>
+      <w:r>
+        <w:rPr>
+          <w:lang w:val="sv-SE"/>
+        </w:rPr>
+        <w:t>Sentinel-2 tetap berperan sebagai INPUT model, bukan sumber label.</w:t>
       </w:r>
     </w:p>
     <w:p>
@@ -9497,12 +9373,6 @@
         <w:gridCol w:w="5760"/>
       </w:tblGrid>
       <w:tr>
-        <w:tblPrEx>
-          <w:tblCellMar>
-            <w:top w:w="0" w:type="dxa"/>
-            <w:bottom w:w="0" w:type="dxa"/>
-          </w:tblCellMar>
-        </w:tblPrEx>
         <w:trPr>
           <w:tblHeader/>
         </w:trPr>
@@ -9603,12 +9473,6 @@
         </w:tc>
       </w:tr>
       <w:tr>
-        <w:tblPrEx>
-          <w:tblCellMar>
-            <w:top w:w="0" w:type="dxa"/>
-            <w:bottom w:w="0" w:type="dxa"/>
-          </w:tblCellMar>
-        </w:tblPrEx>
         <w:tc>
           <w:tcPr>
             <w:tcW w:w="1200" w:type="dxa"/>
@@ -9730,12 +9594,6 @@
         </w:tc>
       </w:tr>
       <w:tr>
-        <w:tblPrEx>
-          <w:tblCellMar>
-            <w:top w:w="0" w:type="dxa"/>
-            <w:bottom w:w="0" w:type="dxa"/>
-          </w:tblCellMar>
-        </w:tblPrEx>
         <w:tc>
           <w:tcPr>
             <w:tcW w:w="1200" w:type="dxa"/>
@@ -9841,12 +9699,6 @@
         </w:tc>
       </w:tr>
       <w:tr>
-        <w:tblPrEx>
-          <w:tblCellMar>
-            <w:top w:w="0" w:type="dxa"/>
-            <w:bottom w:w="0" w:type="dxa"/>
-          </w:tblCellMar>
-        </w:tblPrEx>
         <w:tc>
           <w:tcPr>
             <w:tcW w:w="1200" w:type="dxa"/>
@@ -9959,12 +9811,6 @@
         </w:tc>
       </w:tr>
       <w:tr>
-        <w:tblPrEx>
-          <w:tblCellMar>
-            <w:top w:w="0" w:type="dxa"/>
-            <w:bottom w:w="0" w:type="dxa"/>
-          </w:tblCellMar>
-        </w:tblPrEx>
         <w:tc>
           <w:tcPr>
             <w:tcW w:w="1200" w:type="dxa"/>
@@ -10051,12 +9897,6 @@
         </w:tc>
       </w:tr>
       <w:tr>
-        <w:tblPrEx>
-          <w:tblCellMar>
-            <w:top w:w="0" w:type="dxa"/>
-            <w:bottom w:w="0" w:type="dxa"/>
-          </w:tblCellMar>
-        </w:tblPrEx>
         <w:tc>
           <w:tcPr>
             <w:tcW w:w="1200" w:type="dxa"/>
@@ -10143,12 +9983,6 @@
         </w:tc>
       </w:tr>
       <w:tr>
-        <w:tblPrEx>
-          <w:tblCellMar>
-            <w:top w:w="0" w:type="dxa"/>
-            <w:bottom w:w="0" w:type="dxa"/>
-          </w:tblCellMar>
-        </w:tblPrEx>
         <w:tc>
           <w:tcPr>
             <w:tcW w:w="1200" w:type="dxa"/>
@@ -10344,12 +10178,6 @@
         <w:gridCol w:w="8460"/>
       </w:tblGrid>
       <w:tr>
-        <w:tblPrEx>
-          <w:tblCellMar>
-            <w:top w:w="0" w:type="dxa"/>
-            <w:bottom w:w="0" w:type="dxa"/>
-          </w:tblCellMar>
-        </w:tblPrEx>
         <w:trPr>
           <w:tblHeader/>
         </w:trPr>
@@ -10413,12 +10241,6 @@
         </w:tc>
       </w:tr>
       <w:tr>
-        <w:tblPrEx>
-          <w:tblCellMar>
-            <w:top w:w="0" w:type="dxa"/>
-            <w:bottom w:w="0" w:type="dxa"/>
-          </w:tblCellMar>
-        </w:tblPrEx>
         <w:tc>
           <w:tcPr>
             <w:tcW w:w="1500" w:type="dxa"/>
@@ -10555,12 +10377,6 @@
         </w:tc>
       </w:tr>
       <w:tr>
-        <w:tblPrEx>
-          <w:tblCellMar>
-            <w:top w:w="0" w:type="dxa"/>
-            <w:bottom w:w="0" w:type="dxa"/>
-          </w:tblCellMar>
-        </w:tblPrEx>
         <w:tc>
           <w:tcPr>
             <w:tcW w:w="1500" w:type="dxa"/>
@@ -10832,12 +10648,6 @@
         </w:tc>
       </w:tr>
       <w:tr>
-        <w:tblPrEx>
-          <w:tblCellMar>
-            <w:top w:w="0" w:type="dxa"/>
-            <w:bottom w:w="0" w:type="dxa"/>
-          </w:tblCellMar>
-        </w:tblPrEx>
         <w:tc>
           <w:tcPr>
             <w:tcW w:w="1500" w:type="dxa"/>
@@ -10965,12 +10775,6 @@
         </w:tc>
       </w:tr>
       <w:tr>
-        <w:tblPrEx>
-          <w:tblCellMar>
-            <w:top w:w="0" w:type="dxa"/>
-            <w:bottom w:w="0" w:type="dxa"/>
-          </w:tblCellMar>
-        </w:tblPrEx>
         <w:tc>
           <w:tcPr>
             <w:tcW w:w="1500" w:type="dxa"/>
@@ -11210,12 +11014,6 @@
         </w:tc>
       </w:tr>
       <w:tr>
-        <w:tblPrEx>
-          <w:tblCellMar>
-            <w:top w:w="0" w:type="dxa"/>
-            <w:bottom w:w="0" w:type="dxa"/>
-          </w:tblCellMar>
-        </w:tblPrEx>
         <w:tc>
           <w:tcPr>
             <w:tcW w:w="1500" w:type="dxa"/>
@@ -12322,8 +12120,14 @@
     <w:p>
       <w:pPr>
         <w:pStyle w:val="Heading3"/>
+        <w:rPr>
+          <w:lang w:val="sv-SE"/>
+        </w:rPr>
       </w:pPr>
       <w:r>
+        <w:rPr>
+          <w:lang w:val="sv-SE"/>
+        </w:rPr>
         <w:t>Metode training (berbasis praktik jurnal LULC Sentinel-2):</w:t>
       </w:r>
     </w:p>
@@ -12371,26 +12175,6 @@
         </w:numPr>
         <w:spacing w:after="80" w:line="320" w:lineRule="auto"/>
       </w:pPr>
-      <w:proofErr w:type="spellStart"/>
-      <w:proofErr w:type="spellEnd"/>
-      <w:proofErr w:type="spellStart"/>
-      <w:proofErr w:type="spellEnd"/>
-      <w:proofErr w:type="spellStart"/>
-      <w:proofErr w:type="spellEnd"/>
-      <w:proofErr w:type="spellStart"/>
-      <w:proofErr w:type="spellEnd"/>
-      <w:proofErr w:type="spellStart"/>
-      <w:proofErr w:type="spellEnd"/>
-      <w:proofErr w:type="spellStart"/>
-      <w:proofErr w:type="spellEnd"/>
-      <w:proofErr w:type="spellStart"/>
-      <w:proofErr w:type="spellEnd"/>
-      <w:proofErr w:type="spellStart"/>
-      <w:proofErr w:type="spellEnd"/>
-      <w:proofErr w:type="spellStart"/>
-      <w:proofErr w:type="spellEnd"/>
-      <w:proofErr w:type="spellStart"/>
-      <w:proofErr w:type="spellEnd"/>
       <w:r>
         <w:t>Dynamic World sebagai peta dasar label — remap 9 kelas DW ke 7 kelas proyek (semua piksel terisi otomatis).</w:t>
       </w:r>
@@ -12408,6 +12192,9 @@
         </w:rPr>
       </w:pPr>
       <w:r>
+        <w:rPr>
+          <w:lang w:val="sv-SE"/>
+        </w:rPr>
         <w:t>Hansen GFC 2025 v1.13 sebagai overlay Lahan Terbuka — lossyear ≥ 2019 dengan erosion 1 piksel.</w:t>
       </w:r>
     </w:p>
@@ -12420,22 +12207,6 @@
         </w:numPr>
         <w:spacing w:after="80" w:line="320" w:lineRule="auto"/>
       </w:pPr>
-      <w:proofErr w:type="spellStart"/>
-      <w:proofErr w:type="spellEnd"/>
-      <w:proofErr w:type="spellStart"/>
-      <w:proofErr w:type="spellEnd"/>
-      <w:proofErr w:type="spellStart"/>
-      <w:proofErr w:type="spellEnd"/>
-      <w:proofErr w:type="spellStart"/>
-      <w:proofErr w:type="spellEnd"/>
-      <w:proofErr w:type="spellStart"/>
-      <w:proofErr w:type="spellEnd"/>
-      <w:proofErr w:type="spellStart"/>
-      <w:proofErr w:type="spellEnd"/>
-      <w:proofErr w:type="spellStart"/>
-      <w:proofErr w:type="spellEnd"/>
-      <w:proofErr w:type="spellStart"/>
-      <w:proofErr w:type="spellEnd"/>
       <w:r>
         <w:t>FDP Palm Probability 2025a sebagai overlay Sawit — probability ≥ 0,5, diterapkan terakhir.</w:t>
       </w:r>
@@ -12445,6 +12216,7 @@
         <w:pStyle w:val="ListParagraph"/>
       </w:pPr>
       <w:r>
+        <w:lastRenderedPageBreak/>
         <w:t>Global Mining Footprint (union Tang &amp; Werner 2023 + Maus dkk. 2022) sebagai overlay Tambang — poligon dirasterisasi → Kelas 5.</w:t>
       </w:r>
     </w:p>
@@ -12474,7 +12246,6 @@
         <w:spacing w:after="80" w:line="320" w:lineRule="auto"/>
       </w:pPr>
       <w:r>
-        <w:lastRenderedPageBreak/>
         <w:t xml:space="preserve">Model </w:t>
       </w:r>
       <w:proofErr w:type="spellStart"/>
@@ -12618,17 +12389,11 @@
         <w:tblLook w:val="04A0" w:firstRow="1" w:lastRow="0" w:firstColumn="1" w:lastColumn="0" w:noHBand="0" w:noVBand="1"/>
       </w:tblPr>
       <w:tblGrid>
-        <w:gridCol w:w="1859"/>
-        <w:gridCol w:w="1856"/>
-        <w:gridCol w:w="6245"/>
+        <w:gridCol w:w="1336"/>
+        <w:gridCol w:w="1258"/>
+        <w:gridCol w:w="7570"/>
       </w:tblGrid>
       <w:tr>
-        <w:tblPrEx>
-          <w:tblCellMar>
-            <w:top w:w="0" w:type="dxa"/>
-            <w:bottom w:w="0" w:type="dxa"/>
-          </w:tblCellMar>
-        </w:tblPrEx>
         <w:trPr>
           <w:tblHeader/>
         </w:trPr>
@@ -12729,12 +12494,6 @@
         </w:tc>
       </w:tr>
       <w:tr>
-        <w:tblPrEx>
-          <w:tblCellMar>
-            <w:top w:w="0" w:type="dxa"/>
-            <w:bottom w:w="0" w:type="dxa"/>
-          </w:tblCellMar>
-        </w:tblPrEx>
         <w:tc>
           <w:tcPr>
             <w:tcW w:w="2000" w:type="dxa"/>
@@ -12826,12 +12585,6 @@
         </w:tc>
       </w:tr>
       <w:tr>
-        <w:tblPrEx>
-          <w:tblCellMar>
-            <w:top w:w="0" w:type="dxa"/>
-            <w:bottom w:w="0" w:type="dxa"/>
-          </w:tblCellMar>
-        </w:tblPrEx>
         <w:tc>
           <w:tcPr>
             <w:tcW w:w="2000" w:type="dxa"/>
@@ -12930,12 +12683,6 @@
         </w:tc>
       </w:tr>
       <w:tr>
-        <w:tblPrEx>
-          <w:tblCellMar>
-            <w:top w:w="0" w:type="dxa"/>
-            <w:bottom w:w="0" w:type="dxa"/>
-          </w:tblCellMar>
-        </w:tblPrEx>
         <w:tc>
           <w:tcPr>
             <w:tcW w:w="2000" w:type="dxa"/>
@@ -13034,12 +12781,6 @@
         </w:tc>
       </w:tr>
       <w:tr>
-        <w:tblPrEx>
-          <w:tblCellMar>
-            <w:top w:w="0" w:type="dxa"/>
-            <w:bottom w:w="0" w:type="dxa"/>
-          </w:tblCellMar>
-        </w:tblPrEx>
         <w:tc>
           <w:tcPr>
             <w:tcW w:w="2000" w:type="dxa"/>
@@ -13083,8 +12824,6 @@
             </w:tcMar>
           </w:tcPr>
           <w:p>
-            <w:proofErr w:type="spellStart"/>
-            <w:proofErr w:type="spellEnd"/>
             <w:r>
               <w:t>Training (label Lahan Terbuka)</w:t>
             </w:r>
@@ -13114,12 +12853,6 @@
         </w:tc>
       </w:tr>
       <w:tr>
-        <w:tblPrEx>
-          <w:tblCellMar>
-            <w:top w:w="0" w:type="dxa"/>
-            <w:bottom w:w="0" w:type="dxa"/>
-          </w:tblCellMar>
-        </w:tblPrEx>
         <w:tc>
           <w:tcPr>
             <w:tcW w:w="2000" w:type="dxa"/>
@@ -13272,12 +13005,6 @@
         <w:gridCol w:w="6760"/>
       </w:tblGrid>
       <w:tr>
-        <w:tblPrEx>
-          <w:tblCellMar>
-            <w:top w:w="0" w:type="dxa"/>
-            <w:bottom w:w="0" w:type="dxa"/>
-          </w:tblCellMar>
-        </w:tblPrEx>
         <w:trPr>
           <w:tblHeader/>
         </w:trPr>
@@ -13371,12 +13098,6 @@
         </w:tc>
       </w:tr>
       <w:tr>
-        <w:tblPrEx>
-          <w:tblCellMar>
-            <w:top w:w="0" w:type="dxa"/>
-            <w:bottom w:w="0" w:type="dxa"/>
-          </w:tblCellMar>
-        </w:tblPrEx>
         <w:tc>
           <w:tcPr>
             <w:tcW w:w="800" w:type="dxa"/>
@@ -13492,12 +13213,6 @@
         </w:tc>
       </w:tr>
       <w:tr>
-        <w:tblPrEx>
-          <w:tblCellMar>
-            <w:top w:w="0" w:type="dxa"/>
-            <w:bottom w:w="0" w:type="dxa"/>
-          </w:tblCellMar>
-        </w:tblPrEx>
         <w:tc>
           <w:tcPr>
             <w:tcW w:w="800" w:type="dxa"/>
@@ -13627,12 +13342,6 @@
         </w:tc>
       </w:tr>
       <w:tr>
-        <w:tblPrEx>
-          <w:tblCellMar>
-            <w:top w:w="0" w:type="dxa"/>
-            <w:bottom w:w="0" w:type="dxa"/>
-          </w:tblCellMar>
-        </w:tblPrEx>
         <w:tc>
           <w:tcPr>
             <w:tcW w:w="800" w:type="dxa"/>
@@ -13655,6 +13364,7 @@
                 <w:sz w:val="20"/>
                 <w:szCs w:val="20"/>
               </w:rPr>
+              <w:lastRenderedPageBreak/>
               <w:t>2</w:t>
             </w:r>
           </w:p>
@@ -13676,8 +13386,6 @@
             </w:tcMar>
           </w:tcPr>
           <w:p>
-            <w:proofErr w:type="spellStart"/>
-            <w:proofErr w:type="spellEnd"/>
             <w:r>
               <w:t>Lahan Terbuka</w:t>
             </w:r>
@@ -13700,37 +13408,27 @@
             </w:tcMar>
           </w:tcPr>
           <w:p>
-            <w:proofErr w:type="spellStart"/>
-            <w:proofErr w:type="spellEnd"/>
-            <w:proofErr w:type="spellStart"/>
-            <w:proofErr w:type="spellEnd"/>
-            <w:proofErr w:type="spellStart"/>
-            <w:proofErr w:type="spellEnd"/>
-            <w:proofErr w:type="spellStart"/>
-            <w:proofErr w:type="spellEnd"/>
-            <w:proofErr w:type="spellStart"/>
-            <w:proofErr w:type="spellEnd"/>
-            <w:proofErr w:type="spellStart"/>
-            <w:proofErr w:type="spellEnd"/>
-            <w:proofErr w:type="spellStart"/>
-            <w:proofErr w:type="spellEnd"/>
-            <w:proofErr w:type="spellStart"/>
-            <w:proofErr w:type="spellEnd"/>
-            <w:proofErr w:type="spellStart"/>
-            <w:proofErr w:type="spellEnd"/>
-            <w:r>
-              <w:t>Kondisi fisik STATIS: lahan gundul/terbuka — bekas hutan yang baru hilang (Hansen lossyear &gt;= 2019, setelah erosi 1 piksel) atau tanah terbuka/non-vegetasi (DW bare/snow). Catatan: "deforestasi" sebagai PERISTIWA (Hutan -&gt; kelas lain) dihitung di deteksi perubahan (Bagian 4.4), bukan kelas statis ini. Warna: merah #E03B24.</w:t>
+            <w:r>
+              <w:rPr>
+                <w:lang w:val="sv-SE"/>
+              </w:rPr>
+              <w:t xml:space="preserve">Kondisi fisik STATIS: lahan gundul/terbuka — bekas hutan yang baru hilang (Hansen lossyear &gt;= 2019, setelah erosi 1 piksel) atau tanah terbuka/non-vegetasi (DW bare/snow). Catatan: "deforestasi" sebagai PERISTIWA (Hutan -&gt; kelas lain) dihitung di deteksi perubahan (Bagian 4.4), bukan kelas statis ini. </w:t>
+            </w:r>
+            <w:r>
+              <w:t xml:space="preserve">Warna: </w:t>
+            </w:r>
+            <w:proofErr w:type="spellStart"/>
+            <w:r>
+              <w:t>merah</w:t>
+            </w:r>
+            <w:proofErr w:type="spellEnd"/>
+            <w:r>
+              <w:t xml:space="preserve"> #E03B24.</w:t>
             </w:r>
           </w:p>
         </w:tc>
       </w:tr>
       <w:tr>
-        <w:tblPrEx>
-          <w:tblCellMar>
-            <w:top w:w="0" w:type="dxa"/>
-            <w:bottom w:w="0" w:type="dxa"/>
-          </w:tblCellMar>
-        </w:tblPrEx>
         <w:tc>
           <w:tcPr>
             <w:tcW w:w="800" w:type="dxa"/>
@@ -13825,29 +13523,24 @@
             </w:tcMar>
           </w:tcPr>
           <w:p>
-            <w:proofErr w:type="spellStart"/>
-            <w:proofErr w:type="spellEnd"/>
-            <w:proofErr w:type="spellStart"/>
-            <w:proofErr w:type="spellEnd"/>
-            <w:proofErr w:type="spellStart"/>
-            <w:proofErr w:type="spellEnd"/>
-            <w:proofErr w:type="spellStart"/>
-            <w:proofErr w:type="spellEnd"/>
-            <w:proofErr w:type="spellStart"/>
-            <w:proofErr w:type="spellEnd"/>
-            <w:r>
-              <w:t>Perkebunan kelapa sawit (industri maupun rakyat). Sumber label: FDP Palm Probability model 2025a (probability &gt;= 0,5), diterapkan paling akhir agar kelas Sawit pasti terwakili. Warna: oranye #F97316.</w:t>
+            <w:r>
+              <w:rPr>
+                <w:lang w:val="sv-SE"/>
+              </w:rPr>
+              <w:t xml:space="preserve">Perkebunan kelapa sawit (industri maupun rakyat). </w:t>
+            </w:r>
+            <w:proofErr w:type="spellStart"/>
+            <w:r>
+              <w:t>Sumber</w:t>
+            </w:r>
+            <w:proofErr w:type="spellEnd"/>
+            <w:r>
+              <w:t xml:space="preserve"> label: FDP Palm Probability model 2025a (probability &gt;= 0,5), diterapkan paling akhir agar kelas Sawit pasti terwakili. Warna: oranye #F97316.</w:t>
             </w:r>
           </w:p>
         </w:tc>
       </w:tr>
       <w:tr>
-        <w:tblPrEx>
-          <w:tblCellMar>
-            <w:top w:w="0" w:type="dxa"/>
-            <w:bottom w:w="0" w:type="dxa"/>
-          </w:tblCellMar>
-        </w:tblPrEx>
         <w:tc>
           <w:tcPr>
             <w:tcW w:w="800" w:type="dxa"/>
@@ -13935,32 +13628,6 @@
             </w:tcMar>
           </w:tcPr>
           <w:p>
-            <w:proofErr w:type="spellStart"/>
-            <w:proofErr w:type="spellEnd"/>
-            <w:proofErr w:type="spellStart"/>
-            <w:proofErr w:type="spellEnd"/>
-            <w:proofErr w:type="spellStart"/>
-            <w:proofErr w:type="spellEnd"/>
-            <w:proofErr w:type="spellStart"/>
-            <w:proofErr w:type="spellEnd"/>
-            <w:proofErr w:type="spellStart"/>
-            <w:proofErr w:type="spellEnd"/>
-            <w:proofErr w:type="spellStart"/>
-            <w:proofErr w:type="spellEnd"/>
-            <w:proofErr w:type="spellStart"/>
-            <w:proofErr w:type="spellEnd"/>
-            <w:proofErr w:type="spellStart"/>
-            <w:proofErr w:type="spellEnd"/>
-            <w:proofErr w:type="spellStart"/>
-            <w:proofErr w:type="spellEnd"/>
-            <w:proofErr w:type="spellStart"/>
-            <w:proofErr w:type="spellEnd"/>
-            <w:proofErr w:type="spellStart"/>
-            <w:proofErr w:type="spellEnd"/>
-            <w:proofErr w:type="spellStart"/>
-            <w:proofErr w:type="spellEnd"/>
-            <w:proofErr w:type="spellStart"/>
-            <w:proofErr w:type="spellEnd"/>
             <w:r>
               <w:t>Pertanian &amp; vegetasi non-hutan: padi, sagu, jagung, ladang campur, semak, rumput (Dynamic World grass/crops/shrub + ESA cropland). Warna: kuning #E9C46A.</w:t>
             </w:r>
@@ -13968,12 +13635,6 @@
         </w:tc>
       </w:tr>
       <w:tr>
-        <w:tblPrEx>
-          <w:tblCellMar>
-            <w:top w:w="0" w:type="dxa"/>
-            <w:bottom w:w="0" w:type="dxa"/>
-          </w:tblCellMar>
-        </w:tblPrEx>
         <w:tc>
           <w:tcPr>
             <w:tcW w:w="800" w:type="dxa"/>
@@ -13996,7 +13657,6 @@
                 <w:sz w:val="20"/>
                 <w:szCs w:val="20"/>
               </w:rPr>
-              <w:lastRenderedPageBreak/>
               <w:t>5</w:t>
             </w:r>
           </w:p>
@@ -14018,8 +13678,6 @@
             </w:tcMar>
           </w:tcPr>
           <w:p>
-            <w:proofErr w:type="spellStart"/>
-            <w:proofErr w:type="spellEnd"/>
             <w:r>
               <w:t>Tambang</w:t>
             </w:r>
@@ -14048,7 +13706,18 @@
               </w:rPr>
             </w:pPr>
             <w:r>
-              <w:t>Area pertambangan aktif maupun bekas: pit, tailing, heap leach, infrastruktur tambang. Sumber: Global Mining Footprint (union Tang &amp; Werner 2023 + Maus dkk. 2022, Sentinel-2 ~2019). Warna: ungu #8E24AA.</w:t>
+              <w:rPr>
+                <w:lang w:val="sv-SE"/>
+              </w:rPr>
+              <w:t xml:space="preserve">Area pertambangan aktif maupun bekas: pit, tailing, heap leach, infrastruktur tambang. </w:t>
+            </w:r>
+            <w:proofErr w:type="spellStart"/>
+            <w:r>
+              <w:t>Sumber</w:t>
+            </w:r>
+            <w:proofErr w:type="spellEnd"/>
+            <w:r>
+              <w:t>: Global Mining Footprint (union Tang &amp; Werner 2023 + Maus dkk. 2022, Sentinel-2 ~2019). Warna: ungu #8E24AA.</w:t>
             </w:r>
           </w:p>
         </w:tc>
@@ -14056,7 +13725,7 @@
       <w:tr>
         <w:tc>
           <w:tcPr>
-            <w:tcW w:type="dxa" w:w="800"/>
+            <w:tcW w:w="800" w:type="dxa"/>
           </w:tcPr>
           <w:p>
             <w:r>
@@ -14066,7 +13735,7 @@
         </w:tc>
         <w:tc>
           <w:tcPr>
-            <w:tcW w:type="dxa" w:w="2400"/>
+            <w:tcW w:w="2400" w:type="dxa"/>
           </w:tcPr>
           <w:p>
             <w:r>
@@ -14076,18 +13745,48 @@
         </w:tc>
         <w:tc>
           <w:tcPr>
-            <w:tcW w:type="dxa" w:w="6760"/>
-          </w:tcPr>
-          <w:p>
-            <w:r>
-              <w:t>Lahan terbangun: permukiman, kota, infrastruktur jalan dan bangunan. Sumber: Dynamic World "Built" (kelas 6) + ESA "Built-up" (kelas 50). Warna: abu-abu #757575. Kelas langka di Papua (hanya kota besar: Jayapura, Sorong, Timika, Merauke).</w:t>
+            <w:tcW w:w="6760" w:type="dxa"/>
+          </w:tcPr>
+          <w:p>
+            <w:pPr>
+              <w:rPr>
+                <w:lang w:val="sv-SE"/>
+              </w:rPr>
+            </w:pPr>
+            <w:r>
+              <w:rPr>
+                <w:lang w:val="sv-SE"/>
+              </w:rPr>
+              <w:t xml:space="preserve">Lahan terbangun: permukiman, kota, infrastruktur jalan dan bangunan. </w:t>
+            </w:r>
+            <w:proofErr w:type="spellStart"/>
+            <w:r>
+              <w:t>Sumber</w:t>
+            </w:r>
+            <w:proofErr w:type="spellEnd"/>
+            <w:r>
+              <w:t xml:space="preserve">: Dynamic World "Built" (kelas 6) + ESA "Built-up" (kelas 50). Warna: abu-abu #757575. </w:t>
+            </w:r>
+            <w:r>
+              <w:rPr>
+                <w:lang w:val="sv-SE"/>
+              </w:rPr>
+              <w:t>Kelas langka di Papua (hanya kota besar: Jayapura, Sorong, Timika, Merauke).</w:t>
             </w:r>
           </w:p>
         </w:tc>
       </w:tr>
     </w:tbl>
     <w:p>
-      <w:r>
+      <w:pPr>
+        <w:rPr>
+          <w:lang w:val="sv-SE"/>
+        </w:rPr>
+      </w:pPr>
+      <w:r>
+        <w:rPr>
+          <w:lang w:val="sv-SE"/>
+        </w:rPr>
         <w:t>Catatan penting (kelas vs peristiwa): ketujuh nama di atas adalah KELAS tutupan lahan — kondisi fisik suatu piksel SEKARANG. "Deforestasi" TIDAK menjadi salah satu kelas, melainkan PERISTIWA perubahan dari Hutan ke kelas lain (Lahan Terbuka, Sawit, Tambang, Permukiman, atau Pertanian Lain) yang dihitung pada tahap deteksi perubahan — lihat Bagian 4.4. Total deforestasi Papua = jumlah luas SEMUA jenis transisi tersebut, bukan hanya Kelas 2.</w:t>
       </w:r>
     </w:p>
@@ -14116,6 +13815,9 @@
         </w:rPr>
       </w:pPr>
       <w:r>
+        <w:rPr>
+          <w:lang w:val="sv-SE"/>
+        </w:rPr>
         <w:t>Kelas 5 (Tambang): label dari union footprint Tang &amp; Werner 2023 + Maus dkk. 2022 (snapshot ~2019, Sentinel-2). Footprint = "guru lokasi"; model belajar pola tambang dari citra Sentinel-2 2025 → saat inferensi bisa menandai tambang serupa yang belum terdata. Keterbatasan jujur: footprint global under-capture (Grasberg parsial; tambang ilegal sulit), dan luas hasil model bukan luas konsesi.</w:t>
       </w:r>
     </w:p>
@@ -14170,7 +13872,14 @@
         <w:rPr>
           <w:lang w:val="sv-SE"/>
         </w:rPr>
-        <w:t>Dalam dunia nyata, deforestasi mencakup semua konversi hutan menjadi kelas apapun: ke lahan terbuka, ke sawit, ke pertanian, maupun ke permukiman atau tambang. Namun di dalam model segmentasi, satu piksel hanya bisa mempunyai satu label di waktu tertentu. Untuk mengatasi ini, proyek membedakan antara KELAS STATIS dan PERISTIWA TRANSISI:</w:t>
+        <w:t xml:space="preserve">Dalam dunia nyata, deforestasi mencakup semua konversi hutan menjadi kelas apapun: ke lahan terbuka, ke sawit, ke pertanian, maupun ke permukiman atau tambang. Namun di dalam </w:t>
+      </w:r>
+      <w:r>
+        <w:rPr>
+          <w:lang w:val="sv-SE"/>
+        </w:rPr>
+        <w:lastRenderedPageBreak/>
+        <w:t>model segmentasi, satu piksel hanya bisa mempunyai satu label di waktu tertentu. Untuk mengatasi ini, proyek membedakan antara KELAS STATIS dan PERISTIWA TRANSISI:</w:t>
       </w:r>
     </w:p>
     <w:p>
@@ -14182,14 +13891,35 @@
         </w:numPr>
         <w:spacing w:after="80" w:line="320" w:lineRule="auto"/>
       </w:pPr>
-      <w:proofErr w:type="spellStart"/>
-      <w:proofErr w:type="spellEnd"/>
-      <w:proofErr w:type="spellStart"/>
-      <w:proofErr w:type="spellEnd"/>
-      <w:proofErr w:type="spellStart"/>
-      <w:proofErr w:type="spellEnd"/>
-      <w:r>
-        <w:t>Kelas Statis (Kelas 2 — Lahan Terbuka): piksel yang saat ini gundul dan belum jadi apa-apa. Sumber utama: Hansen lossyear.</w:t>
+      <w:r>
+        <w:rPr>
+          <w:lang w:val="sv-SE"/>
+        </w:rPr>
+        <w:t xml:space="preserve">Kelas Statis (Kelas 2 — Lahan Terbuka): piksel yang saat ini gundul dan belum jadi apa-apa. </w:t>
+      </w:r>
+      <w:proofErr w:type="spellStart"/>
+      <w:r>
+        <w:t>Sumber</w:t>
+      </w:r>
+      <w:proofErr w:type="spellEnd"/>
+      <w:r>
+        <w:t xml:space="preserve"> </w:t>
+      </w:r>
+      <w:proofErr w:type="spellStart"/>
+      <w:r>
+        <w:t>utama</w:t>
+      </w:r>
+      <w:proofErr w:type="spellEnd"/>
+      <w:r>
+        <w:t xml:space="preserve">: Hansen </w:t>
+      </w:r>
+      <w:proofErr w:type="spellStart"/>
+      <w:r>
+        <w:t>lossyear</w:t>
+      </w:r>
+      <w:proofErr w:type="spellEnd"/>
+      <w:r>
+        <w:t>.</w:t>
       </w:r>
     </w:p>
     <w:p>
@@ -14359,20 +14089,6 @@
         <w:spacing w:after="120" w:line="320" w:lineRule="auto"/>
         <w:jc w:val="both"/>
       </w:pPr>
-      <w:proofErr w:type="spellStart"/>
-      <w:proofErr w:type="spellEnd"/>
-      <w:proofErr w:type="spellStart"/>
-      <w:proofErr w:type="spellEnd"/>
-      <w:proofErr w:type="spellStart"/>
-      <w:proofErr w:type="spellEnd"/>
-      <w:proofErr w:type="spellStart"/>
-      <w:proofErr w:type="spellEnd"/>
-      <w:proofErr w:type="spellStart"/>
-      <w:proofErr w:type="spellEnd"/>
-      <w:proofErr w:type="spellStart"/>
-      <w:proofErr w:type="spellEnd"/>
-      <w:proofErr w:type="spellStart"/>
-      <w:proofErr w:type="spellEnd"/>
       <w:r>
         <w:t>Lima jenis transisi deforestasi yang dilaporkan proyek ini:</w:t>
       </w:r>
@@ -14400,12 +14116,6 @@
         <w:gridCol w:w="3960"/>
       </w:tblGrid>
       <w:tr>
-        <w:tblPrEx>
-          <w:tblCellMar>
-            <w:top w:w="0" w:type="dxa"/>
-            <w:bottom w:w="0" w:type="dxa"/>
-          </w:tblCellMar>
-        </w:tblPrEx>
         <w:trPr>
           <w:tblHeader/>
         </w:trPr>
@@ -14521,12 +14231,6 @@
         </w:tc>
       </w:tr>
       <w:tr>
-        <w:tblPrEx>
-          <w:tblCellMar>
-            <w:top w:w="0" w:type="dxa"/>
-            <w:bottom w:w="0" w:type="dxa"/>
-          </w:tblCellMar>
-        </w:tblPrEx>
         <w:tc>
           <w:tcPr>
             <w:tcW w:w="3000" w:type="dxa"/>
@@ -14645,12 +14349,6 @@
         </w:tc>
       </w:tr>
       <w:tr>
-        <w:tblPrEx>
-          <w:tblCellMar>
-            <w:top w:w="0" w:type="dxa"/>
-            <w:bottom w:w="0" w:type="dxa"/>
-          </w:tblCellMar>
-        </w:tblPrEx>
         <w:tc>
           <w:tcPr>
             <w:tcW w:w="3000" w:type="dxa"/>
@@ -14752,12 +14450,6 @@
         </w:tc>
       </w:tr>
       <w:tr>
-        <w:tblPrEx>
-          <w:tblCellMar>
-            <w:top w:w="0" w:type="dxa"/>
-            <w:bottom w:w="0" w:type="dxa"/>
-          </w:tblCellMar>
-        </w:tblPrEx>
         <w:tc>
           <w:tcPr>
             <w:tcW w:w="3000" w:type="dxa"/>
@@ -14917,12 +14609,6 @@
         </w:tc>
       </w:tr>
       <w:tr>
-        <w:tblPrEx>
-          <w:tblCellMar>
-            <w:top w:w="0" w:type="dxa"/>
-            <w:bottom w:w="0" w:type="dxa"/>
-          </w:tblCellMar>
-        </w:tblPrEx>
         <w:tc>
           <w:tcPr>
             <w:tcW w:w="3000" w:type="dxa"/>
@@ -14940,8 +14626,6 @@
             </w:tcMar>
           </w:tcPr>
           <w:p>
-            <w:proofErr w:type="spellStart"/>
-            <w:proofErr w:type="spellEnd"/>
             <w:r>
               <w:t>Hutan → Tambang</w:t>
             </w:r>
@@ -14970,6 +14654,9 @@
               </w:rPr>
             </w:pPr>
             <w:r>
+              <w:rPr>
+                <w:lang w:val="sv-SE"/>
+              </w:rPr>
               <w:t>Pembukaan atau pengambilalihan hutan untuk kegiatan pertambangan</w:t>
             </w:r>
           </w:p>
@@ -14991,11 +14678,6 @@
             </w:tcMar>
           </w:tcPr>
           <w:p>
-            <w:pPr>
-              <w:rPr>
-                <w:lang w:val="sv-SE"/>
-              </w:rPr>
-            </w:pPr>
             <w:r>
               <w:t>Overlay Mining Footprint (union TW+Maus) + selisih mask T1 dan T2</w:t>
             </w:r>
@@ -15005,7 +14687,7 @@
       <w:tr>
         <w:tc>
           <w:tcPr>
-            <w:tcW w:type="dxa" w:w="3000"/>
+            <w:tcW w:w="3000" w:type="dxa"/>
           </w:tcPr>
           <w:p>
             <w:r>
@@ -15015,21 +14697,37 @@
         </w:tc>
         <w:tc>
           <w:tcPr>
-            <w:tcW w:type="dxa" w:w="3000"/>
-          </w:tcPr>
-          <w:p>
-            <w:r>
+            <w:tcW w:w="3000" w:type="dxa"/>
+          </w:tcPr>
+          <w:p>
+            <w:pPr>
+              <w:rPr>
+                <w:lang w:val="sv-SE"/>
+              </w:rPr>
+            </w:pPr>
+            <w:r>
+              <w:rPr>
+                <w:lang w:val="sv-SE"/>
+              </w:rPr>
               <w:t>Konversi hutan untuk pengembangan kawasan permukiman, kota, atau infrastruktur</w:t>
             </w:r>
           </w:p>
         </w:tc>
         <w:tc>
           <w:tcPr>
-            <w:tcW w:type="dxa" w:w="3960"/>
-          </w:tcPr>
-          <w:p>
-            <w:r>
-              <w:t>DW Built (remap ke Permukiman) + selisih mask T1 dan T2</w:t>
+            <w:tcW w:w="3960" w:type="dxa"/>
+          </w:tcPr>
+          <w:p>
+            <w:r>
+              <w:t xml:space="preserve">DW Built (remap </w:t>
+            </w:r>
+            <w:proofErr w:type="spellStart"/>
+            <w:r>
+              <w:t>ke</w:t>
+            </w:r>
+            <w:proofErr w:type="spellEnd"/>
+            <w:r>
+              <w:t xml:space="preserve"> Permukiman) + selisih mask T1 dan T2</w:t>
             </w:r>
           </w:p>
         </w:tc>
@@ -15314,9 +15012,24 @@
     <w:p>
       <w:pPr>
         <w:pStyle w:val="ListParagraph"/>
+        <w:rPr>
+          <w:lang w:val="sv-SE"/>
+        </w:rPr>
       </w:pPr>
       <w:r>
-        <w:t>Cohen's Kappa — metrik akurasi yang mengoreksi kesepakatan akibat kebetulan; lebih jujur daripada Overall Accuracy untuk data tidak seimbang. Interpretasi: κ &gt; 0,80 sangat baik, 0,60–0,80 baik.</w:t>
+        <w:rPr>
+          <w:lang w:val="sv-SE"/>
+        </w:rPr>
+        <w:t xml:space="preserve">Cohen's Kappa — metrik akurasi yang mengoreksi kesepakatan akibat kebetulan; lebih jujur daripada Overall Accuracy untuk data tidak seimbang. Interpretasi: </w:t>
+      </w:r>
+      <w:r>
+        <w:t>κ</w:t>
+      </w:r>
+      <w:r>
+        <w:rPr>
+          <w:lang w:val="sv-SE"/>
+        </w:rPr>
+        <w:t xml:space="preserve"> &gt; 0,80 sangat baik, 0,60–0,80 baik.</w:t>
       </w:r>
     </w:p>
     <w:p>
@@ -15328,6 +15041,10 @@
         </w:rPr>
       </w:pPr>
       <w:r>
+        <w:rPr>
+          <w:lang w:val="sv-SE"/>
+        </w:rPr>
+        <w:lastRenderedPageBreak/>
         <w:t>Target minimum: mean IoU di atas 0,60 dan IoU kelas Lahan Terbuka/Tambang di atas 0,50. Target ideal: mean IoU di atas 0,75 dan Cohen's Kappa di atas 0,80. IoU per-kelas dicatat setiap epoch selama training sehingga perkembangan kelas minoritas (Tambang, Permukiman) dapat dipantau.</w:t>
       </w:r>
     </w:p>
@@ -15401,12 +15118,6 @@
         <w:gridCol w:w="1960"/>
       </w:tblGrid>
       <w:tr>
-        <w:tblPrEx>
-          <w:tblCellMar>
-            <w:top w:w="0" w:type="dxa"/>
-            <w:bottom w:w="0" w:type="dxa"/>
-          </w:tblCellMar>
-        </w:tblPrEx>
         <w:trPr>
           <w:tblHeader/>
         </w:trPr>
@@ -15520,12 +15231,6 @@
         </w:tc>
       </w:tr>
       <w:tr>
-        <w:tblPrEx>
-          <w:tblCellMar>
-            <w:top w:w="0" w:type="dxa"/>
-            <w:bottom w:w="0" w:type="dxa"/>
-          </w:tblCellMar>
-        </w:tblPrEx>
         <w:tc>
           <w:tcPr>
             <w:tcW w:w="3000" w:type="dxa"/>
@@ -15654,12 +15359,6 @@
         </w:tc>
       </w:tr>
       <w:tr>
-        <w:tblPrEx>
-          <w:tblCellMar>
-            <w:top w:w="0" w:type="dxa"/>
-            <w:bottom w:w="0" w:type="dxa"/>
-          </w:tblCellMar>
-        </w:tblPrEx>
         <w:tc>
           <w:tcPr>
             <w:tcW w:w="3000" w:type="dxa"/>
@@ -15755,12 +15454,6 @@
         </w:tc>
       </w:tr>
       <w:tr>
-        <w:tblPrEx>
-          <w:tblCellMar>
-            <w:top w:w="0" w:type="dxa"/>
-            <w:bottom w:w="0" w:type="dxa"/>
-          </w:tblCellMar>
-        </w:tblPrEx>
         <w:tc>
           <w:tcPr>
             <w:tcW w:w="3000" w:type="dxa"/>
@@ -15882,12 +15575,6 @@
         </w:tc>
       </w:tr>
       <w:tr>
-        <w:tblPrEx>
-          <w:tblCellMar>
-            <w:top w:w="0" w:type="dxa"/>
-            <w:bottom w:w="0" w:type="dxa"/>
-          </w:tblCellMar>
-        </w:tblPrEx>
         <w:tc>
           <w:tcPr>
             <w:tcW w:w="3000" w:type="dxa"/>
@@ -15974,12 +15661,6 @@
         </w:tc>
       </w:tr>
       <w:tr>
-        <w:tblPrEx>
-          <w:tblCellMar>
-            <w:top w:w="0" w:type="dxa"/>
-            <w:bottom w:w="0" w:type="dxa"/>
-          </w:tblCellMar>
-        </w:tblPrEx>
         <w:tc>
           <w:tcPr>
             <w:tcW w:w="3000" w:type="dxa"/>
@@ -16131,46 +15812,6 @@
         <w:spacing w:after="120" w:line="320" w:lineRule="auto"/>
         <w:jc w:val="both"/>
       </w:pPr>
-      <w:proofErr w:type="spellStart"/>
-      <w:proofErr w:type="spellEnd"/>
-      <w:proofErr w:type="spellStart"/>
-      <w:proofErr w:type="spellEnd"/>
-      <w:proofErr w:type="spellStart"/>
-      <w:proofErr w:type="spellEnd"/>
-      <w:proofErr w:type="spellStart"/>
-      <w:proofErr w:type="spellEnd"/>
-      <w:proofErr w:type="spellStart"/>
-      <w:proofErr w:type="spellEnd"/>
-      <w:proofErr w:type="spellStart"/>
-      <w:proofErr w:type="spellEnd"/>
-      <w:proofErr w:type="spellStart"/>
-      <w:proofErr w:type="spellEnd"/>
-      <w:proofErr w:type="spellStart"/>
-      <w:proofErr w:type="spellEnd"/>
-      <w:proofErr w:type="spellStart"/>
-      <w:proofErr w:type="spellEnd"/>
-      <w:proofErr w:type="spellStart"/>
-      <w:proofErr w:type="spellEnd"/>
-      <w:proofErr w:type="spellStart"/>
-      <w:proofErr w:type="spellEnd"/>
-      <w:proofErr w:type="spellStart"/>
-      <w:proofErr w:type="spellEnd"/>
-      <w:proofErr w:type="spellStart"/>
-      <w:proofErr w:type="spellEnd"/>
-      <w:proofErr w:type="spellStart"/>
-      <w:proofErr w:type="spellEnd"/>
-      <w:proofErr w:type="spellStart"/>
-      <w:proofErr w:type="spellEnd"/>
-      <w:proofErr w:type="spellStart"/>
-      <w:proofErr w:type="spellEnd"/>
-      <w:proofErr w:type="spellStart"/>
-      <w:proofErr w:type="spellEnd"/>
-      <w:proofErr w:type="spellStart"/>
-      <w:proofErr w:type="spellEnd"/>
-      <w:proofErr w:type="spellStart"/>
-      <w:proofErr w:type="spellEnd"/>
-      <w:proofErr w:type="spellStart"/>
-      <w:proofErr w:type="spellEnd"/>
       <w:r>
         <w:t>Cara daftar GEE (sudah dilakukan): Buka console.cloud.google.com/earth-engine, buat project bernama forestwatch-papua-unand-unand, pilih registrasi Noncommercial, organization type "Public or private academic institution", institution "Andalas University", pilih quota tier "Community" (tanpa perlu kartu kredit). Karena email institusi UNAND berbasis Outlook, gunakan Gmail pribadi namun tetap mencantumkan afiliasi Universitas Andalas. Google Drive: buat folder bernama "Satria Data 3.0" di My Drive.</w:t>
       </w:r>
@@ -16178,27 +15819,16 @@
     <w:p>
       <w:pPr>
         <w:pStyle w:val="Heading2"/>
+        <w:rPr>
+          <w:lang w:val="sv-SE"/>
+        </w:rPr>
       </w:pPr>
       <w:bookmarkStart w:id="26" w:name="_Toc231018790"/>
       <w:r>
-        <w:lastRenderedPageBreak/>
-        <w:t xml:space="preserve">5.2. </w:t>
-      </w:r>
-      <w:proofErr w:type="spellStart"/>
-      <w:r>
-        <w:t>Perangkat</w:t>
-      </w:r>
-      <w:proofErr w:type="spellEnd"/>
-      <w:r>
-        <w:t xml:space="preserve"> Lunak yang Wajib </w:t>
-      </w:r>
-      <w:proofErr w:type="spellStart"/>
-      <w:r>
-        <w:t>Diinstal</w:t>
-      </w:r>
-      <w:proofErr w:type="spellEnd"/>
-      <w:r>
-        <w:t xml:space="preserve"> di Laptop</w:t>
+        <w:rPr>
+          <w:lang w:val="sv-SE"/>
+        </w:rPr>
+        <w:t>5.2. Perangkat Lunak yang Wajib Diinstal di Laptop</w:t>
       </w:r>
       <w:bookmarkEnd w:id="26"/>
     </w:p>
@@ -16207,77 +15837,11 @@
         <w:spacing w:after="120" w:line="320" w:lineRule="auto"/>
         <w:jc w:val="both"/>
       </w:pPr>
-      <w:proofErr w:type="spellStart"/>
-      <w:r>
-        <w:t>Seluruh</w:t>
-      </w:r>
-      <w:proofErr w:type="spellEnd"/>
-      <w:r>
-        <w:t xml:space="preserve"> </w:t>
-      </w:r>
-      <w:proofErr w:type="spellStart"/>
-      <w:r>
-        <w:t>pekerjaan</w:t>
-      </w:r>
-      <w:proofErr w:type="spellEnd"/>
-      <w:r>
-        <w:t xml:space="preserve"> </w:t>
-      </w:r>
-      <w:proofErr w:type="spellStart"/>
-      <w:r>
-        <w:t>koding</w:t>
-      </w:r>
-      <w:proofErr w:type="spellEnd"/>
-      <w:r>
-        <w:t xml:space="preserve"> </w:t>
-      </w:r>
-      <w:proofErr w:type="spellStart"/>
-      <w:r>
-        <w:t>dilakukan</w:t>
-      </w:r>
-      <w:proofErr w:type="spellEnd"/>
-      <w:r>
-        <w:t xml:space="preserve"> di VS Code (</w:t>
-      </w:r>
-      <w:proofErr w:type="spellStart"/>
-      <w:r>
-        <w:t>lokal</w:t>
-      </w:r>
-      <w:proofErr w:type="spellEnd"/>
-      <w:r>
-        <w:t xml:space="preserve">), </w:t>
-      </w:r>
-      <w:proofErr w:type="spellStart"/>
-      <w:r>
-        <w:t>sedangkan</w:t>
-      </w:r>
-      <w:proofErr w:type="spellEnd"/>
-      <w:r>
-        <w:t xml:space="preserve"> </w:t>
-      </w:r>
-      <w:proofErr w:type="spellStart"/>
-      <w:r>
-        <w:t>pelatihan</w:t>
-      </w:r>
-      <w:proofErr w:type="spellEnd"/>
-      <w:r>
-        <w:t xml:space="preserve"> model </w:t>
-      </w:r>
-      <w:proofErr w:type="spellStart"/>
-      <w:r>
-        <w:t>dilakukan</w:t>
-      </w:r>
-      <w:proofErr w:type="spellEnd"/>
-      <w:r>
-        <w:t xml:space="preserve"> di Google </w:t>
-      </w:r>
-      <w:proofErr w:type="spellStart"/>
-      <w:r>
-        <w:t>Colab</w:t>
-      </w:r>
-      <w:proofErr w:type="spellEnd"/>
-      <w:r>
-        <w:t xml:space="preserve"> (cloud). </w:t>
+      <w:r>
+        <w:rPr>
+          <w:lang w:val="sv-SE"/>
+        </w:rPr>
+        <w:t xml:space="preserve">Seluruh pekerjaan koding dilakukan di VS Code (lokal), sedangkan pelatihan model dilakukan di Google Colab (cloud). </w:t>
       </w:r>
       <w:r>
         <w:rPr>
@@ -16332,12 +15896,6 @@
         <w:gridCol w:w="6460"/>
       </w:tblGrid>
       <w:tr>
-        <w:tblPrEx>
-          <w:tblCellMar>
-            <w:top w:w="0" w:type="dxa"/>
-            <w:bottom w:w="0" w:type="dxa"/>
-          </w:tblCellMar>
-        </w:tblPrEx>
         <w:trPr>
           <w:tblHeader/>
         </w:trPr>
@@ -16412,12 +15970,6 @@
         </w:tc>
       </w:tr>
       <w:tr>
-        <w:tblPrEx>
-          <w:tblCellMar>
-            <w:top w:w="0" w:type="dxa"/>
-            <w:bottom w:w="0" w:type="dxa"/>
-          </w:tblCellMar>
-        </w:tblPrEx>
         <w:tc>
           <w:tcPr>
             <w:tcW w:w="3500" w:type="dxa"/>
@@ -16478,12 +16030,6 @@
         </w:tc>
       </w:tr>
       <w:tr>
-        <w:tblPrEx>
-          <w:tblCellMar>
-            <w:top w:w="0" w:type="dxa"/>
-            <w:bottom w:w="0" w:type="dxa"/>
-          </w:tblCellMar>
-        </w:tblPrEx>
         <w:tc>
           <w:tcPr>
             <w:tcW w:w="3500" w:type="dxa"/>
@@ -16620,12 +16166,6 @@
         </w:tc>
       </w:tr>
       <w:tr>
-        <w:tblPrEx>
-          <w:tblCellMar>
-            <w:top w:w="0" w:type="dxa"/>
-            <w:bottom w:w="0" w:type="dxa"/>
-          </w:tblCellMar>
-        </w:tblPrEx>
         <w:tc>
           <w:tcPr>
             <w:tcW w:w="3500" w:type="dxa"/>
@@ -16686,12 +16226,6 @@
         </w:tc>
       </w:tr>
       <w:tr>
-        <w:tblPrEx>
-          <w:tblCellMar>
-            <w:top w:w="0" w:type="dxa"/>
-            <w:bottom w:w="0" w:type="dxa"/>
-          </w:tblCellMar>
-        </w:tblPrEx>
         <w:tc>
           <w:tcPr>
             <w:tcW w:w="3500" w:type="dxa"/>
@@ -16827,6 +16361,7 @@
           <w:sz w:val="20"/>
           <w:szCs w:val="20"/>
         </w:rPr>
+        <w:lastRenderedPageBreak/>
         <w:t xml:space="preserve">pip install </w:t>
       </w:r>
       <w:proofErr w:type="spellStart"/>
@@ -17014,7 +16549,7 @@
           <w:sz w:val="20"/>
           <w:szCs w:val="20"/>
         </w:rPr>
-        <w:t xml:space="preserve">pip install flask </w:t>
+        <w:t xml:space="preserve">pip install flask React + </w:t>
       </w:r>
       <w:proofErr w:type="gramStart"/>
       <w:r>
@@ -17023,7 +16558,7 @@
           <w:sz w:val="20"/>
           <w:szCs w:val="20"/>
         </w:rPr>
-        <w:t>React + Vite  #</w:t>
+        <w:t>Vite  #</w:t>
       </w:r>
       <w:proofErr w:type="gramEnd"/>
       <w:r>
@@ -17103,12 +16638,6 @@
         <w:gridCol w:w="6960"/>
       </w:tblGrid>
       <w:tr>
-        <w:tblPrEx>
-          <w:tblCellMar>
-            <w:top w:w="0" w:type="dxa"/>
-            <w:bottom w:w="0" w:type="dxa"/>
-          </w:tblCellMar>
-        </w:tblPrEx>
         <w:trPr>
           <w:tblHeader/>
         </w:trPr>
@@ -17174,12 +16703,6 @@
         </w:tc>
       </w:tr>
       <w:tr>
-        <w:tblPrEx>
-          <w:tblCellMar>
-            <w:top w:w="0" w:type="dxa"/>
-            <w:bottom w:w="0" w:type="dxa"/>
-          </w:tblCellMar>
-        </w:tblPrEx>
         <w:tc>
           <w:tcPr>
             <w:tcW w:w="3000" w:type="dxa"/>
@@ -17240,12 +16763,6 @@
         </w:tc>
       </w:tr>
       <w:tr>
-        <w:tblPrEx>
-          <w:tblCellMar>
-            <w:top w:w="0" w:type="dxa"/>
-            <w:bottom w:w="0" w:type="dxa"/>
-          </w:tblCellMar>
-        </w:tblPrEx>
         <w:tc>
           <w:tcPr>
             <w:tcW w:w="3000" w:type="dxa"/>
@@ -17357,12 +16874,6 @@
         </w:tc>
       </w:tr>
       <w:tr>
-        <w:tblPrEx>
-          <w:tblCellMar>
-            <w:top w:w="0" w:type="dxa"/>
-            <w:bottom w:w="0" w:type="dxa"/>
-          </w:tblCellMar>
-        </w:tblPrEx>
         <w:tc>
           <w:tcPr>
             <w:tcW w:w="3000" w:type="dxa"/>
@@ -17483,12 +16994,6 @@
         </w:tc>
       </w:tr>
       <w:tr>
-        <w:tblPrEx>
-          <w:tblCellMar>
-            <w:top w:w="0" w:type="dxa"/>
-            <w:bottom w:w="0" w:type="dxa"/>
-          </w:tblCellMar>
-        </w:tblPrEx>
         <w:tc>
           <w:tcPr>
             <w:tcW w:w="3000" w:type="dxa"/>
@@ -17719,12 +17224,6 @@
         </w:numPr>
         <w:spacing w:after="80" w:line="320" w:lineRule="auto"/>
       </w:pPr>
-      <w:proofErr w:type="spellStart"/>
-      <w:proofErr w:type="spellEnd"/>
-      <w:proofErr w:type="spellStart"/>
-      <w:proofErr w:type="spellEnd"/>
-      <w:proofErr w:type="spellStart"/>
-      <w:proofErr w:type="spellEnd"/>
       <w:r>
         <w:t>Membangun label fusion berbasis Dynamic World (peta dasar) + ESA WorldCover (cross-check) + Hansen GFC (Lahan Terbuka) + FDP Palm 2025a (Sawit) + Global Mining Footprint (Tambang).</w:t>
       </w:r>
@@ -17738,12 +17237,6 @@
         </w:numPr>
         <w:spacing w:after="80" w:line="320" w:lineRule="auto"/>
       </w:pPr>
-      <w:proofErr w:type="spellStart"/>
-      <w:proofErr w:type="spellEnd"/>
-      <w:proofErr w:type="spellStart"/>
-      <w:proofErr w:type="spellEnd"/>
-      <w:proofErr w:type="spellStart"/>
-      <w:proofErr w:type="spellEnd"/>
       <w:r>
         <w:t>Membangun dan melatih model ResNet50-U-Net di Google Colab (GPU T4), dengan teknik: transfer-learning 2-tahap (freeze encoder → unfreeze), resume checkpoint (auto-lanjut bila sesi mati), WeightedRandomSampler untuk kelas langka.</w:t>
       </w:r>
@@ -17844,18 +17337,6 @@
         </w:numPr>
         <w:spacing w:after="80" w:line="320" w:lineRule="auto"/>
       </w:pPr>
-      <w:proofErr w:type="spellStart"/>
-      <w:proofErr w:type="spellEnd"/>
-      <w:proofErr w:type="spellStart"/>
-      <w:proofErr w:type="spellEnd"/>
-      <w:proofErr w:type="spellStart"/>
-      <w:proofErr w:type="spellEnd"/>
-      <w:proofErr w:type="spellStart"/>
-      <w:proofErr w:type="spellEnd"/>
-      <w:proofErr w:type="spellStart"/>
-      <w:proofErr w:type="spellEnd"/>
-      <w:proofErr w:type="spellStart"/>
-      <w:proofErr w:type="spellEnd"/>
       <w:r>
         <w:t>Merancang dan membangun dashboard WebGIS berbasis web (FastAPI backend + React + Vite frontend) dengan peta interaktif Papua 7 kelas tutupan lahan.</w:t>
       </w:r>
@@ -17876,6 +17357,7 @@
         <w:rPr>
           <w:lang w:val="sv-SE"/>
         </w:rPr>
+        <w:lastRenderedPageBreak/>
         <w:t>Mengintegrasikan hasil model (peta segmentasi dan titik deforestasi) ke dalam peta web.</w:t>
       </w:r>
     </w:p>
@@ -17888,30 +17370,6 @@
         </w:numPr>
         <w:spacing w:after="80" w:line="320" w:lineRule="auto"/>
       </w:pPr>
-      <w:proofErr w:type="spellStart"/>
-      <w:proofErr w:type="spellEnd"/>
-      <w:proofErr w:type="spellStart"/>
-      <w:proofErr w:type="spellEnd"/>
-      <w:proofErr w:type="spellStart"/>
-      <w:proofErr w:type="spellEnd"/>
-      <w:proofErr w:type="spellStart"/>
-      <w:proofErr w:type="spellEnd"/>
-      <w:proofErr w:type="spellStart"/>
-      <w:proofErr w:type="spellEnd"/>
-      <w:proofErr w:type="spellStart"/>
-      <w:proofErr w:type="spellEnd"/>
-      <w:proofErr w:type="spellStart"/>
-      <w:proofErr w:type="spellEnd"/>
-      <w:proofErr w:type="spellStart"/>
-      <w:proofErr w:type="spellEnd"/>
-      <w:proofErr w:type="spellStart"/>
-      <w:proofErr w:type="spellEnd"/>
-      <w:proofErr w:type="spellStart"/>
-      <w:proofErr w:type="spellEnd"/>
-      <w:proofErr w:type="spellStart"/>
-      <w:proofErr w:type="spellEnd"/>
-      <w:proofErr w:type="spellStart"/>
-      <w:proofErr w:type="spellEnd"/>
       <w:r>
         <w:t>Membuat fitur: layer tutupan lahan 7 kelas, penanda alert deforestasi berwarna sesuai jenis transisi, slider waktu, dan statistik.</w:t>
       </w:r>
@@ -18211,12 +17669,6 @@
         <w:gridCol w:w="7760"/>
       </w:tblGrid>
       <w:tr>
-        <w:tblPrEx>
-          <w:tblCellMar>
-            <w:top w:w="0" w:type="dxa"/>
-            <w:bottom w:w="0" w:type="dxa"/>
-          </w:tblCellMar>
-        </w:tblPrEx>
         <w:trPr>
           <w:tblHeader/>
         </w:trPr>
@@ -18245,7 +17697,6 @@
                 <w:sz w:val="20"/>
                 <w:szCs w:val="20"/>
               </w:rPr>
-              <w:lastRenderedPageBreak/>
               <w:t>Penanggung</w:t>
             </w:r>
             <w:proofErr w:type="spellEnd"/>
@@ -18290,12 +17741,6 @@
         </w:tc>
       </w:tr>
       <w:tr>
-        <w:tblPrEx>
-          <w:tblCellMar>
-            <w:top w:w="0" w:type="dxa"/>
-            <w:bottom w:w="0" w:type="dxa"/>
-          </w:tblCellMar>
-        </w:tblPrEx>
         <w:tc>
           <w:tcPr>
             <w:tcW w:w="2200" w:type="dxa"/>
@@ -18542,12 +17987,6 @@
         </w:tc>
       </w:tr>
       <w:tr>
-        <w:tblPrEx>
-          <w:tblCellMar>
-            <w:top w:w="0" w:type="dxa"/>
-            <w:bottom w:w="0" w:type="dxa"/>
-          </w:tblCellMar>
-        </w:tblPrEx>
         <w:tc>
           <w:tcPr>
             <w:tcW w:w="2200" w:type="dxa"/>
@@ -18608,12 +18047,6 @@
         </w:tc>
       </w:tr>
       <w:tr>
-        <w:tblPrEx>
-          <w:tblCellMar>
-            <w:top w:w="0" w:type="dxa"/>
-            <w:bottom w:w="0" w:type="dxa"/>
-          </w:tblCellMar>
-        </w:tblPrEx>
         <w:tc>
           <w:tcPr>
             <w:tcW w:w="2200" w:type="dxa"/>
@@ -19041,6 +18474,7 @@
       <w:bookmarkStart w:id="34" w:name="_Toc231018798"/>
       <w:proofErr w:type="spellStart"/>
       <w:r>
+        <w:lastRenderedPageBreak/>
         <w:t>Minggu</w:t>
       </w:r>
       <w:proofErr w:type="spellEnd"/>
@@ -19079,12 +18513,6 @@
         <w:gridCol w:w="7760"/>
       </w:tblGrid>
       <w:tr>
-        <w:tblPrEx>
-          <w:tblCellMar>
-            <w:top w:w="0" w:type="dxa"/>
-            <w:bottom w:w="0" w:type="dxa"/>
-          </w:tblCellMar>
-        </w:tblPrEx>
         <w:trPr>
           <w:tblHeader/>
         </w:trPr>
@@ -19157,12 +18585,6 @@
         </w:tc>
       </w:tr>
       <w:tr>
-        <w:tblPrEx>
-          <w:tblCellMar>
-            <w:top w:w="0" w:type="dxa"/>
-            <w:bottom w:w="0" w:type="dxa"/>
-          </w:tblCellMar>
-        </w:tblPrEx>
         <w:tc>
           <w:tcPr>
             <w:tcW w:w="2200" w:type="dxa"/>
@@ -19418,12 +18840,6 @@
         </w:tc>
       </w:tr>
       <w:tr>
-        <w:tblPrEx>
-          <w:tblCellMar>
-            <w:top w:w="0" w:type="dxa"/>
-            <w:bottom w:w="0" w:type="dxa"/>
-          </w:tblCellMar>
-        </w:tblPrEx>
         <w:tc>
           <w:tcPr>
             <w:tcW w:w="2200" w:type="dxa"/>
@@ -19484,12 +18900,6 @@
         </w:tc>
       </w:tr>
       <w:tr>
-        <w:tblPrEx>
-          <w:tblCellMar>
-            <w:top w:w="0" w:type="dxa"/>
-            <w:bottom w:w="0" w:type="dxa"/>
-          </w:tblCellMar>
-        </w:tblPrEx>
         <w:tc>
           <w:tcPr>
             <w:tcW w:w="2200" w:type="dxa"/>
@@ -19746,12 +19156,6 @@
         <w:gridCol w:w="7760"/>
       </w:tblGrid>
       <w:tr>
-        <w:tblPrEx>
-          <w:tblCellMar>
-            <w:top w:w="0" w:type="dxa"/>
-            <w:bottom w:w="0" w:type="dxa"/>
-          </w:tblCellMar>
-        </w:tblPrEx>
         <w:trPr>
           <w:tblHeader/>
         </w:trPr>
@@ -19824,12 +19228,6 @@
         </w:tc>
       </w:tr>
       <w:tr>
-        <w:tblPrEx>
-          <w:tblCellMar>
-            <w:top w:w="0" w:type="dxa"/>
-            <w:bottom w:w="0" w:type="dxa"/>
-          </w:tblCellMar>
-        </w:tblPrEx>
         <w:tc>
           <w:tcPr>
             <w:tcW w:w="2200" w:type="dxa"/>
@@ -19890,12 +19288,6 @@
         </w:tc>
       </w:tr>
       <w:tr>
-        <w:tblPrEx>
-          <w:tblCellMar>
-            <w:top w:w="0" w:type="dxa"/>
-            <w:bottom w:w="0" w:type="dxa"/>
-          </w:tblCellMar>
-        </w:tblPrEx>
         <w:tc>
           <w:tcPr>
             <w:tcW w:w="2200" w:type="dxa"/>
@@ -19999,12 +19391,6 @@
         </w:tc>
       </w:tr>
       <w:tr>
-        <w:tblPrEx>
-          <w:tblCellMar>
-            <w:top w:w="0" w:type="dxa"/>
-            <w:bottom w:w="0" w:type="dxa"/>
-          </w:tblCellMar>
-        </w:tblPrEx>
         <w:tc>
           <w:tcPr>
             <w:tcW w:w="2200" w:type="dxa"/>
@@ -20048,181 +19434,18 @@
             </w:tcMar>
           </w:tcPr>
           <w:p>
-            <w:proofErr w:type="spellStart"/>
-            <w:r>
-              <w:rPr>
-                <w:sz w:val="20"/>
-                <w:szCs w:val="20"/>
-              </w:rPr>
-              <w:t>Selesaikan</w:t>
-            </w:r>
-            <w:proofErr w:type="spellEnd"/>
-            <w:r>
-              <w:rPr>
-                <w:sz w:val="20"/>
-                <w:szCs w:val="20"/>
-              </w:rPr>
-              <w:t xml:space="preserve"> </w:t>
-            </w:r>
-            <w:proofErr w:type="spellStart"/>
-            <w:r>
-              <w:rPr>
-                <w:sz w:val="20"/>
-                <w:szCs w:val="20"/>
-              </w:rPr>
-              <w:t>bagian</w:t>
-            </w:r>
-            <w:proofErr w:type="spellEnd"/>
-            <w:r>
-              <w:rPr>
-                <w:sz w:val="20"/>
-                <w:szCs w:val="20"/>
-              </w:rPr>
-              <w:t xml:space="preserve"> </w:t>
-            </w:r>
-            <w:proofErr w:type="spellStart"/>
-            <w:r>
-              <w:rPr>
-                <w:sz w:val="20"/>
-                <w:szCs w:val="20"/>
-              </w:rPr>
-              <w:t>Pembahasan</w:t>
-            </w:r>
-            <w:proofErr w:type="spellEnd"/>
-            <w:r>
-              <w:rPr>
-                <w:sz w:val="20"/>
-                <w:szCs w:val="20"/>
-              </w:rPr>
-              <w:t xml:space="preserve"> </w:t>
-            </w:r>
-            <w:proofErr w:type="spellStart"/>
-            <w:r>
-              <w:rPr>
-                <w:sz w:val="20"/>
-                <w:szCs w:val="20"/>
-              </w:rPr>
-              <w:t>dengan</w:t>
-            </w:r>
-            <w:proofErr w:type="spellEnd"/>
-            <w:r>
-              <w:rPr>
-                <w:sz w:val="20"/>
-                <w:szCs w:val="20"/>
-              </w:rPr>
-              <w:t xml:space="preserve"> </w:t>
-            </w:r>
-            <w:proofErr w:type="spellStart"/>
-            <w:r>
-              <w:rPr>
-                <w:sz w:val="20"/>
-                <w:szCs w:val="20"/>
-              </w:rPr>
-              <w:t>angka</w:t>
-            </w:r>
-            <w:proofErr w:type="spellEnd"/>
-            <w:r>
-              <w:rPr>
-                <w:sz w:val="20"/>
-                <w:szCs w:val="20"/>
-              </w:rPr>
-              <w:t xml:space="preserve"> </w:t>
-            </w:r>
-            <w:proofErr w:type="spellStart"/>
-            <w:r>
-              <w:rPr>
-                <w:sz w:val="20"/>
-                <w:szCs w:val="20"/>
-              </w:rPr>
-              <w:t>hasil</w:t>
-            </w:r>
-            <w:proofErr w:type="spellEnd"/>
-            <w:r>
-              <w:rPr>
-                <w:sz w:val="20"/>
-                <w:szCs w:val="20"/>
-              </w:rPr>
-              <w:t xml:space="preserve"> model yang ASLI, </w:t>
-            </w:r>
-            <w:proofErr w:type="spellStart"/>
-            <w:r>
-              <w:rPr>
-                <w:sz w:val="20"/>
-                <w:szCs w:val="20"/>
-              </w:rPr>
-              <w:t>tulis</w:t>
-            </w:r>
-            <w:proofErr w:type="spellEnd"/>
-            <w:r>
-              <w:rPr>
-                <w:sz w:val="20"/>
-                <w:szCs w:val="20"/>
-              </w:rPr>
-              <w:t xml:space="preserve"> </w:t>
-            </w:r>
-            <w:proofErr w:type="spellStart"/>
-            <w:r>
-              <w:rPr>
-                <w:sz w:val="20"/>
-                <w:szCs w:val="20"/>
-              </w:rPr>
-              <w:t>studi</w:t>
-            </w:r>
-            <w:proofErr w:type="spellEnd"/>
-            <w:r>
-              <w:rPr>
-                <w:sz w:val="20"/>
-                <w:szCs w:val="20"/>
-              </w:rPr>
-              <w:t xml:space="preserve"> </w:t>
-            </w:r>
-            <w:proofErr w:type="spellStart"/>
-            <w:r>
-              <w:rPr>
-                <w:sz w:val="20"/>
-                <w:szCs w:val="20"/>
-              </w:rPr>
-              <w:t>kasus</w:t>
-            </w:r>
-            <w:proofErr w:type="spellEnd"/>
-            <w:r>
-              <w:rPr>
-                <w:sz w:val="20"/>
-                <w:szCs w:val="20"/>
-              </w:rPr>
-              <w:t xml:space="preserve"> dinamika tutupan lahan Merauke dan </w:t>
-            </w:r>
-            <w:proofErr w:type="spellStart"/>
-            <w:r>
-              <w:rPr>
-                <w:sz w:val="20"/>
-                <w:szCs w:val="20"/>
-              </w:rPr>
-              <w:t>analisis</w:t>
-            </w:r>
-            <w:proofErr w:type="spellEnd"/>
-            <w:r>
-              <w:rPr>
-                <w:sz w:val="20"/>
-                <w:szCs w:val="20"/>
-              </w:rPr>
-              <w:t xml:space="preserve"> </w:t>
-            </w:r>
-            <w:proofErr w:type="spellStart"/>
-            <w:r>
-              <w:rPr>
-                <w:sz w:val="20"/>
-                <w:szCs w:val="20"/>
-              </w:rPr>
-              <w:t>sawit</w:t>
-            </w:r>
-            <w:proofErr w:type="spellEnd"/>
-            <w:r>
-              <w:rPr>
-                <w:sz w:val="20"/>
-                <w:szCs w:val="20"/>
-              </w:rPr>
-              <w:t>.</w:t>
+            <w:pPr>
+              <w:rPr>
+                <w:lang w:val="sv-SE"/>
+              </w:rPr>
+            </w:pPr>
+            <w:r>
+              <w:rPr>
+                <w:sz w:val="20"/>
+                <w:szCs w:val="20"/>
+                <w:lang w:val="sv-SE"/>
+              </w:rPr>
+              <w:t>Selesaikan bagian Pembahasan dengan angka hasil model yang ASLI, tulis studi kasus dinamika tutupan lahan Merauke dan analisis sawit.</w:t>
             </w:r>
           </w:p>
         </w:tc>
@@ -20325,12 +19548,6 @@
         <w:gridCol w:w="7760"/>
       </w:tblGrid>
       <w:tr>
-        <w:tblPrEx>
-          <w:tblCellMar>
-            <w:top w:w="0" w:type="dxa"/>
-            <w:bottom w:w="0" w:type="dxa"/>
-          </w:tblCellMar>
-        </w:tblPrEx>
         <w:trPr>
           <w:tblHeader/>
         </w:trPr>
@@ -20403,12 +19620,6 @@
         </w:tc>
       </w:tr>
       <w:tr>
-        <w:tblPrEx>
-          <w:tblCellMar>
-            <w:top w:w="0" w:type="dxa"/>
-            <w:bottom w:w="0" w:type="dxa"/>
-          </w:tblCellMar>
-        </w:tblPrEx>
         <w:tc>
           <w:tcPr>
             <w:tcW w:w="2200" w:type="dxa"/>
@@ -20469,12 +19680,6 @@
         </w:tc>
       </w:tr>
       <w:tr>
-        <w:tblPrEx>
-          <w:tblCellMar>
-            <w:top w:w="0" w:type="dxa"/>
-            <w:bottom w:w="0" w:type="dxa"/>
-          </w:tblCellMar>
-        </w:tblPrEx>
         <w:tc>
           <w:tcPr>
             <w:tcW w:w="2200" w:type="dxa"/>
@@ -20497,7 +19702,6 @@
                 <w:sz w:val="20"/>
                 <w:szCs w:val="20"/>
               </w:rPr>
-              <w:lastRenderedPageBreak/>
               <w:t>Orang 2</w:t>
             </w:r>
           </w:p>
@@ -20674,12 +19878,6 @@
         </w:tc>
       </w:tr>
       <w:tr>
-        <w:tblPrEx>
-          <w:tblCellMar>
-            <w:top w:w="0" w:type="dxa"/>
-            <w:bottom w:w="0" w:type="dxa"/>
-          </w:tblCellMar>
-        </w:tblPrEx>
         <w:tc>
           <w:tcPr>
             <w:tcW w:w="2200" w:type="dxa"/>
@@ -20806,12 +20004,6 @@
         <w:gridCol w:w="1660"/>
       </w:tblGrid>
       <w:tr>
-        <w:tblPrEx>
-          <w:tblCellMar>
-            <w:top w:w="0" w:type="dxa"/>
-            <w:bottom w:w="0" w:type="dxa"/>
-          </w:tblCellMar>
-        </w:tblPrEx>
         <w:trPr>
           <w:tblHeader/>
         </w:trPr>
@@ -20840,6 +20032,7 @@
                 <w:sz w:val="20"/>
                 <w:szCs w:val="20"/>
               </w:rPr>
+              <w:lastRenderedPageBreak/>
               <w:t>Minggu</w:t>
             </w:r>
             <w:proofErr w:type="spellEnd"/>
@@ -20979,12 +20172,6 @@
         </w:tc>
       </w:tr>
       <w:tr>
-        <w:tblPrEx>
-          <w:tblCellMar>
-            <w:top w:w="0" w:type="dxa"/>
-            <w:bottom w:w="0" w:type="dxa"/>
-          </w:tblCellMar>
-        </w:tblPrEx>
         <w:tc>
           <w:tcPr>
             <w:tcW w:w="1400" w:type="dxa"/>
@@ -21226,12 +20413,6 @@
         </w:tc>
       </w:tr>
       <w:tr>
-        <w:tblPrEx>
-          <w:tblCellMar>
-            <w:top w:w="0" w:type="dxa"/>
-            <w:bottom w:w="0" w:type="dxa"/>
-          </w:tblCellMar>
-        </w:tblPrEx>
         <w:tc>
           <w:tcPr>
             <w:tcW w:w="1400" w:type="dxa"/>
@@ -21457,12 +20638,6 @@
         </w:tc>
       </w:tr>
       <w:tr>
-        <w:tblPrEx>
-          <w:tblCellMar>
-            <w:top w:w="0" w:type="dxa"/>
-            <w:bottom w:w="0" w:type="dxa"/>
-          </w:tblCellMar>
-        </w:tblPrEx>
         <w:tc>
           <w:tcPr>
             <w:tcW w:w="1400" w:type="dxa"/>
@@ -21706,12 +20881,6 @@
         </w:tc>
       </w:tr>
       <w:tr>
-        <w:tblPrEx>
-          <w:tblCellMar>
-            <w:top w:w="0" w:type="dxa"/>
-            <w:bottom w:w="0" w:type="dxa"/>
-          </w:tblCellMar>
-        </w:tblPrEx>
         <w:tc>
           <w:tcPr>
             <w:tcW w:w="1400" w:type="dxa"/>
@@ -22141,6 +21310,25 @@
           <w:lang w:val="sv-SE"/>
         </w:rPr>
         <w:t>Slider waktu untuk membandingkan kondisi hutan antar periode (2021 vs 2025).</w:t>
+      </w:r>
+    </w:p>
+    <w:p>
+      <w:pPr>
+        <w:pStyle w:val="ListParagraph"/>
+        <w:numPr>
+          <w:ilvl w:val="0"/>
+          <w:numId w:val="2"/>
+        </w:numPr>
+        <w:spacing w:after="80" w:line="320" w:lineRule="auto"/>
+        <w:rPr>
+          <w:lang w:val="sv-SE"/>
+        </w:rPr>
+      </w:pPr>
+      <w:r>
+        <w:rPr>
+          <w:lang w:val="sv-SE"/>
+        </w:rPr>
+        <w:t>Studi kasus khusus kawasan dinamika tutupan lahan Merauke sebagai sorotan.</w:t>
       </w:r>
     </w:p>
     <w:p>
@@ -22153,59 +21341,6 @@
         <w:spacing w:after="80" w:line="320" w:lineRule="auto"/>
       </w:pPr>
       <w:r>
-        <w:t xml:space="preserve">Studi </w:t>
-      </w:r>
-      <w:proofErr w:type="spellStart"/>
-      <w:r>
-        <w:t>kasus</w:t>
-      </w:r>
-      <w:proofErr w:type="spellEnd"/>
-      <w:r>
-        <w:t xml:space="preserve"> </w:t>
-      </w:r>
-      <w:proofErr w:type="spellStart"/>
-      <w:r>
-        <w:t>khusus</w:t>
-      </w:r>
-      <w:proofErr w:type="spellEnd"/>
-      <w:r>
-        <w:t xml:space="preserve"> </w:t>
-      </w:r>
-      <w:proofErr w:type="spellStart"/>
-      <w:r>
-        <w:t>kawasan</w:t>
-      </w:r>
-      <w:proofErr w:type="spellEnd"/>
-      <w:r>
-        <w:t xml:space="preserve"> dinamika tutupan lahan Merauke </w:t>
-      </w:r>
-      <w:proofErr w:type="spellStart"/>
-      <w:r>
-        <w:t>sebagai</w:t>
-      </w:r>
-      <w:proofErr w:type="spellEnd"/>
-      <w:r>
-        <w:t xml:space="preserve"> </w:t>
-      </w:r>
-      <w:proofErr w:type="spellStart"/>
-      <w:r>
-        <w:t>sorotan</w:t>
-      </w:r>
-      <w:proofErr w:type="spellEnd"/>
-      <w:r>
-        <w:t>.</w:t>
-      </w:r>
-    </w:p>
-    <w:p>
-      <w:pPr>
-        <w:pStyle w:val="ListParagraph"/>
-        <w:numPr>
-          <w:ilvl w:val="0"/>
-          <w:numId w:val="2"/>
-        </w:numPr>
-        <w:spacing w:after="80" w:line="320" w:lineRule="auto"/>
-      </w:pPr>
-      <w:r>
         <w:t xml:space="preserve">Highlight </w:t>
       </w:r>
       <w:proofErr w:type="spellStart"/>
@@ -22273,34 +21408,14 @@
           <w:lang w:val="sv-SE"/>
         </w:rPr>
       </w:pPr>
-      <w:proofErr w:type="gramStart"/>
-      <w:proofErr w:type="gramEnd"/>
-      <w:proofErr w:type="spellStart"/>
-      <w:proofErr w:type="spellEnd"/>
-      <w:proofErr w:type="spellStart"/>
-      <w:proofErr w:type="spellEnd"/>
-      <w:proofErr w:type="spellStart"/>
-      <w:proofErr w:type="spellEnd"/>
-      <w:proofErr w:type="spellStart"/>
-      <w:proofErr w:type="spellEnd"/>
-      <w:proofErr w:type="spellStart"/>
-      <w:proofErr w:type="spellEnd"/>
-      <w:proofErr w:type="spellStart"/>
-      <w:proofErr w:type="spellEnd"/>
-      <w:proofErr w:type="spellStart"/>
-      <w:proofErr w:type="spellEnd"/>
-      <w:proofErr w:type="spellStart"/>
-      <w:proofErr w:type="spellEnd"/>
-      <w:proofErr w:type="spellStart"/>
-      <w:proofErr w:type="spellEnd"/>
-      <w:proofErr w:type="spellStart"/>
-      <w:proofErr w:type="spellEnd"/>
-      <w:proofErr w:type="spellStart"/>
-      <w:proofErr w:type="spellEnd"/>
-      <w:proofErr w:type="spellStart"/>
-      <w:proofErr w:type="spellEnd"/>
-      <w:r>
-        <w:t>Cara deploy: Backend FastAPI di-deploy ke layanan cloud gratis (Render, Railway, atau Deta.sh). Frontend React + Vite di-deploy ke Vercel atau Netlify. Untuk keperluan lomba, semua layanan ini menyediakan tier gratis yang cukup untuk demo. URL publik didapat dalam hitungan menit setelah deployment.</w:t>
+      <w:r>
+        <w:t xml:space="preserve">Cara deploy: Backend FastAPI di-deploy ke layanan cloud gratis (Render, Railway, atau Deta.sh). Frontend React + Vite di-deploy ke Vercel atau Netlify. Untuk keperluan lomba, semua layanan ini menyediakan tier gratis yang cukup untuk demo. </w:t>
+      </w:r>
+      <w:r>
+        <w:rPr>
+          <w:lang w:val="sv-SE"/>
+        </w:rPr>
+        <w:t>URL publik didapat dalam hitungan menit setelah deployment.</w:t>
       </w:r>
     </w:p>
     <w:p>
@@ -22317,7 +21432,6 @@
           <w:bCs/>
           <w:lang w:val="sv-SE"/>
         </w:rPr>
-        <w:lastRenderedPageBreak/>
         <w:t xml:space="preserve">Strategi tahan demo: </w:t>
       </w:r>
       <w:r>
@@ -22390,12 +21504,6 @@
         <w:gridCol w:w="7160"/>
       </w:tblGrid>
       <w:tr>
-        <w:tblPrEx>
-          <w:tblCellMar>
-            <w:top w:w="0" w:type="dxa"/>
-            <w:bottom w:w="0" w:type="dxa"/>
-          </w:tblCellMar>
-        </w:tblPrEx>
         <w:trPr>
           <w:tblHeader/>
         </w:trPr>
@@ -22424,6 +21532,7 @@
                 <w:sz w:val="20"/>
                 <w:szCs w:val="20"/>
               </w:rPr>
+              <w:lastRenderedPageBreak/>
               <w:t>Ketentuan</w:t>
             </w:r>
             <w:proofErr w:type="spellEnd"/>
@@ -22461,12 +21570,6 @@
         </w:tc>
       </w:tr>
       <w:tr>
-        <w:tblPrEx>
-          <w:tblCellMar>
-            <w:top w:w="0" w:type="dxa"/>
-            <w:bottom w:w="0" w:type="dxa"/>
-          </w:tblCellMar>
-        </w:tblPrEx>
         <w:tc>
           <w:tcPr>
             <w:tcW w:w="2800" w:type="dxa"/>
@@ -22537,12 +21640,6 @@
         </w:tc>
       </w:tr>
       <w:tr>
-        <w:tblPrEx>
-          <w:tblCellMar>
-            <w:top w:w="0" w:type="dxa"/>
-            <w:bottom w:w="0" w:type="dxa"/>
-          </w:tblCellMar>
-        </w:tblPrEx>
         <w:tc>
           <w:tcPr>
             <w:tcW w:w="2800" w:type="dxa"/>
@@ -22612,12 +21709,6 @@
         </w:tc>
       </w:tr>
       <w:tr>
-        <w:tblPrEx>
-          <w:tblCellMar>
-            <w:top w:w="0" w:type="dxa"/>
-            <w:bottom w:w="0" w:type="dxa"/>
-          </w:tblCellMar>
-        </w:tblPrEx>
         <w:tc>
           <w:tcPr>
             <w:tcW w:w="2800" w:type="dxa"/>
@@ -22678,12 +21769,6 @@
         </w:tc>
       </w:tr>
       <w:tr>
-        <w:tblPrEx>
-          <w:tblCellMar>
-            <w:top w:w="0" w:type="dxa"/>
-            <w:bottom w:w="0" w:type="dxa"/>
-          </w:tblCellMar>
-        </w:tblPrEx>
         <w:tc>
           <w:tcPr>
             <w:tcW w:w="2800" w:type="dxa"/>
@@ -22813,12 +21898,6 @@
         </w:tc>
       </w:tr>
       <w:tr>
-        <w:tblPrEx>
-          <w:tblCellMar>
-            <w:top w:w="0" w:type="dxa"/>
-            <w:bottom w:w="0" w:type="dxa"/>
-          </w:tblCellMar>
-        </w:tblPrEx>
         <w:tc>
           <w:tcPr>
             <w:tcW w:w="2800" w:type="dxa"/>
@@ -22879,12 +21958,6 @@
         </w:tc>
       </w:tr>
       <w:tr>
-        <w:tblPrEx>
-          <w:tblCellMar>
-            <w:top w:w="0" w:type="dxa"/>
-            <w:bottom w:w="0" w:type="dxa"/>
-          </w:tblCellMar>
-        </w:tblPrEx>
         <w:tc>
           <w:tcPr>
             <w:tcW w:w="2800" w:type="dxa"/>
@@ -22954,12 +22027,6 @@
         </w:tc>
       </w:tr>
       <w:tr>
-        <w:tblPrEx>
-          <w:tblCellMar>
-            <w:top w:w="0" w:type="dxa"/>
-            <w:bottom w:w="0" w:type="dxa"/>
-          </w:tblCellMar>
-        </w:tblPrEx>
         <w:tc>
           <w:tcPr>
             <w:tcW w:w="2800" w:type="dxa"/>
@@ -23041,12 +22108,6 @@
         </w:tc>
       </w:tr>
       <w:tr>
-        <w:tblPrEx>
-          <w:tblCellMar>
-            <w:top w:w="0" w:type="dxa"/>
-            <w:bottom w:w="0" w:type="dxa"/>
-          </w:tblCellMar>
-        </w:tblPrEx>
         <w:tc>
           <w:tcPr>
             <w:tcW w:w="2800" w:type="dxa"/>
@@ -23116,12 +22177,6 @@
         </w:tc>
       </w:tr>
       <w:tr>
-        <w:tblPrEx>
-          <w:tblCellMar>
-            <w:top w:w="0" w:type="dxa"/>
-            <w:bottom w:w="0" w:type="dxa"/>
-          </w:tblCellMar>
-        </w:tblPrEx>
         <w:tc>
           <w:tcPr>
             <w:tcW w:w="2800" w:type="dxa"/>
@@ -23201,12 +22256,6 @@
         </w:tc>
       </w:tr>
       <w:tr>
-        <w:tblPrEx>
-          <w:tblCellMar>
-            <w:top w:w="0" w:type="dxa"/>
-            <w:bottom w:w="0" w:type="dxa"/>
-          </w:tblCellMar>
-        </w:tblPrEx>
         <w:tc>
           <w:tcPr>
             <w:tcW w:w="2800" w:type="dxa"/>
@@ -23366,14 +22415,7 @@
         <w:rPr>
           <w:lang w:val="sv-SE"/>
         </w:rPr>
-        <w:t xml:space="preserve">Hansen GFC adalah satu-satunya sumber label deforestasi global gratis, tetapi resolusinya lebih kasar (30 meter) dibanding Sentinel-2 (10 meter). Akibatnya label di tepi batas hutan menjadi kurang presisi setelah resampling. Solusi: morphological erosion 1 piksel sebelum dipakai </w:t>
-      </w:r>
-      <w:r>
-        <w:rPr>
-          <w:lang w:val="sv-SE"/>
-        </w:rPr>
-        <w:lastRenderedPageBreak/>
-        <w:t>sebagai label. Sebutkan ini di esai sebagai langkah metodologis yang menambah kekuatan ilmiah.</w:t>
+        <w:t>Hansen GFC adalah satu-satunya sumber label deforestasi global gratis, tetapi resolusinya lebih kasar (30 meter) dibanding Sentinel-2 (10 meter). Akibatnya label di tepi batas hutan menjadi kurang presisi setelah resampling. Solusi: morphological erosion 1 piksel sebelum dipakai sebagai label. Sebutkan ini di esai sebagai langkah metodologis yang menambah kekuatan ilmiah.</w:t>
       </w:r>
     </w:p>
     <w:p>
@@ -23385,20 +22427,43 @@
         </w:numPr>
         <w:spacing w:after="80" w:line="320" w:lineRule="auto"/>
       </w:pPr>
-      <w:proofErr w:type="spellStart"/>
-      <w:proofErr w:type="spellEnd"/>
-      <w:proofErr w:type="spellStart"/>
-      <w:proofErr w:type="spellEnd"/>
-      <w:proofErr w:type="spellStart"/>
-      <w:proofErr w:type="spellEnd"/>
-      <w:proofErr w:type="spellStart"/>
-      <w:proofErr w:type="spellEnd"/>
-      <w:proofErr w:type="spellStart"/>
-      <w:proofErr w:type="spellEnd"/>
-      <w:proofErr w:type="spellStart"/>
-      <w:proofErr w:type="spellEnd"/>
-      <w:r>
-        <w:t>Kelas Tambang (Kelas 5) dan Permukiman (Kelas 6) adalah kelas dengan data paling terbatas. Tambang: sumber footprint (union Tang &amp; Werner 2023 + Maus dkk. 2022, ~2019) tetap under-capture — bahkan Grasberg hanya sebagian, dan tambang baru/ilegal 2019–2025 sering terlewat. Permukiman: sangat jarang di Papua. Kedua kelas ditangani dengan class weights median-frequency + WeightedRandomSampler saat training; IoU per-kelas dipantau tiap epoch. Laporkan IoU apa adanya — kejujuran teknis dinilai juri.</w:t>
+      <w:r>
+        <w:rPr>
+          <w:lang w:val="sv-SE"/>
+        </w:rPr>
+        <w:t xml:space="preserve">Kelas Tambang (Kelas 5) dan Permukiman (Kelas 6) adalah kelas dengan data paling terbatas. Tambang: sumber footprint (union Tang &amp; Werner 2023 + Maus dkk. 2022, ~2019) tetap under-capture — bahkan Grasberg hanya sebagian, dan tambang baru/ilegal 2019–2025 sering terlewat. Permukiman: sangat jarang di Papua. Kedua kelas ditangani dengan class weights median-frequency + WeightedRandomSampler saat training; IoU per-kelas dipantau tiap epoch. </w:t>
+      </w:r>
+      <w:proofErr w:type="spellStart"/>
+      <w:r>
+        <w:t>Laporkan</w:t>
+      </w:r>
+      <w:proofErr w:type="spellEnd"/>
+      <w:r>
+        <w:t xml:space="preserve"> </w:t>
+      </w:r>
+      <w:proofErr w:type="spellStart"/>
+      <w:r>
+        <w:t>IoU</w:t>
+      </w:r>
+      <w:proofErr w:type="spellEnd"/>
+      <w:r>
+        <w:t xml:space="preserve"> </w:t>
+      </w:r>
+      <w:proofErr w:type="spellStart"/>
+      <w:r>
+        <w:t>apa</w:t>
+      </w:r>
+      <w:proofErr w:type="spellEnd"/>
+      <w:r>
+        <w:t xml:space="preserve"> </w:t>
+      </w:r>
+      <w:proofErr w:type="spellStart"/>
+      <w:r>
+        <w:t>adanya</w:t>
+      </w:r>
+      <w:proofErr w:type="spellEnd"/>
+      <w:r>
+        <w:t xml:space="preserve"> — kejujuran teknis dinilai juri.</w:t>
       </w:r>
     </w:p>
     <w:p>
@@ -23419,6 +22484,7 @@
           <w:bCs/>
           <w:lang w:val="sv-SE"/>
         </w:rPr>
+        <w:lastRenderedPageBreak/>
         <w:t xml:space="preserve">Sawit muda (0–3 tahun) sulit terdeteksi. </w:t>
       </w:r>
       <w:r>
@@ -23437,14 +22503,43 @@
         </w:numPr>
         <w:spacing w:after="80" w:line="320" w:lineRule="auto"/>
       </w:pPr>
-      <w:proofErr w:type="spellStart"/>
-      <w:proofErr w:type="spellEnd"/>
-      <w:proofErr w:type="spellStart"/>
-      <w:proofErr w:type="spellEnd"/>
-      <w:proofErr w:type="spellStart"/>
-      <w:proofErr w:type="spellEnd"/>
-      <w:r>
-        <w:t>FDP Palm 2025a berbasis model probabilistik: sawit muda (0–3 tahun) dengan kanopi belum menutup bisa terlewat karena sinyal Sentinel-1/2 lemah. Tangani dengan memperkuat kelas sawit lewat class weights dan monitoring IoU kelas Sawit per epoch.</w:t>
+      <w:r>
+        <w:rPr>
+          <w:lang w:val="sv-SE"/>
+        </w:rPr>
+        <w:t xml:space="preserve">FDP Palm 2025a berbasis model probabilistik: sawit muda (0–3 tahun) dengan kanopi belum menutup bisa terlewat karena sinyal Sentinel-1/2 lemah. </w:t>
+      </w:r>
+      <w:proofErr w:type="spellStart"/>
+      <w:r>
+        <w:t>Tangani</w:t>
+      </w:r>
+      <w:proofErr w:type="spellEnd"/>
+      <w:r>
+        <w:t xml:space="preserve"> </w:t>
+      </w:r>
+      <w:proofErr w:type="spellStart"/>
+      <w:r>
+        <w:t>dengan</w:t>
+      </w:r>
+      <w:proofErr w:type="spellEnd"/>
+      <w:r>
+        <w:t xml:space="preserve"> </w:t>
+      </w:r>
+      <w:proofErr w:type="spellStart"/>
+      <w:r>
+        <w:t>memperkuat</w:t>
+      </w:r>
+      <w:proofErr w:type="spellEnd"/>
+      <w:r>
+        <w:t xml:space="preserve"> </w:t>
+      </w:r>
+      <w:proofErr w:type="spellStart"/>
+      <w:r>
+        <w:t>kelas</w:t>
+      </w:r>
+      <w:proofErr w:type="spellEnd"/>
+      <w:r>
+        <w:t xml:space="preserve"> sawit lewat class weights dan monitoring IoU kelas Sawit per epoch.</w:t>
       </w:r>
     </w:p>
     <w:p>
@@ -23843,8 +22938,6 @@
         </w:numPr>
         <w:spacing w:after="80" w:line="320" w:lineRule="auto"/>
       </w:pPr>
-      <w:proofErr w:type="spellStart"/>
-      <w:proofErr w:type="spellEnd"/>
       <w:r>
         <w:t>Hansen, M. C., dkk. (2025). Global Forest Change 2025 v1.13 (dataset). University of Maryland. Tersedia di: https://glad.earthengine.app/view/global-forest-change</w:t>
       </w:r>
@@ -23859,7 +22952,6 @@
         <w:spacing w:after="80" w:line="320" w:lineRule="auto"/>
       </w:pPr>
       <w:r>
-        <w:lastRenderedPageBreak/>
         <w:t xml:space="preserve">Brown, C. F., </w:t>
       </w:r>
       <w:proofErr w:type="spellStart"/>
@@ -23892,6 +22984,7 @@
         <w:pStyle w:val="ListParagraph"/>
       </w:pPr>
       <w:r>
+        <w:lastRenderedPageBreak/>
         <w:t>Forest Data Partnership (2025). Palm Probability Model 2025a. Google &amp; FAO. Tersedia di: https://developers.google.com/earth-engine/datasets/catalog/projects_forestdatapartnership_assets_palm_model_2025a</w:t>
       </w:r>
     </w:p>
@@ -23938,10 +23031,6 @@
         </w:numPr>
         <w:spacing w:after="80" w:line="320" w:lineRule="auto"/>
       </w:pPr>
-      <w:proofErr w:type="spellStart"/>
-      <w:proofErr w:type="spellEnd"/>
-      <w:proofErr w:type="spellStart"/>
-      <w:proofErr w:type="spellEnd"/>
       <w:r>
         <w:t>Descals, A., dkk. (2021). High-resolution global map of smallholder and industrial closed-canopy oil palm plantations. Earth System Science Data, 13, 1211–1231. [Latar belakang sumber data sawit; digantikan FDP Palm 2025a dalam implementasi proyek.]</w:t>
       </w:r>

</xml_diff>